<commit_message>
Esercitazione 10 + appunti STL
</commit_message>
<xml_diff>
--- a/Appunti lezione/STL libreria (1).docx
+++ b/Appunti lezione/STL libreria (1).docx
@@ -59,13 +59,65 @@
         <w:rPr>
           <w:lang w:val="en-GB"/>
         </w:rPr>
-        <w:t xml:space="preserve"> (coppie chiave valore </w:t>
-      </w:r>
-      <w:r>
-        <w:rPr>
-          <w:lang w:val="en-GB"/>
-        </w:rPr>
-        <w:t>set,multiset, map, multimap)</w:t>
+        <w:t xml:space="preserve"> (</w:t>
+      </w:r>
+      <w:proofErr w:type="spellStart"/>
+      <w:r>
+        <w:rPr>
+          <w:lang w:val="en-GB"/>
+        </w:rPr>
+        <w:t>coppie</w:t>
+      </w:r>
+      <w:proofErr w:type="spellEnd"/>
+      <w:r>
+        <w:rPr>
+          <w:lang w:val="en-GB"/>
+        </w:rPr>
+        <w:t xml:space="preserve"> </w:t>
+      </w:r>
+      <w:proofErr w:type="spellStart"/>
+      <w:r>
+        <w:rPr>
+          <w:lang w:val="en-GB"/>
+        </w:rPr>
+        <w:t>chiave</w:t>
+      </w:r>
+      <w:proofErr w:type="spellEnd"/>
+      <w:r>
+        <w:rPr>
+          <w:lang w:val="en-GB"/>
+        </w:rPr>
+        <w:t xml:space="preserve"> </w:t>
+      </w:r>
+      <w:proofErr w:type="spellStart"/>
+      <w:r>
+        <w:rPr>
+          <w:lang w:val="en-GB"/>
+        </w:rPr>
+        <w:t>valore</w:t>
+      </w:r>
+      <w:proofErr w:type="spellEnd"/>
+      <w:r>
+        <w:rPr>
+          <w:lang w:val="en-GB"/>
+        </w:rPr>
+        <w:t xml:space="preserve"> </w:t>
+      </w:r>
+      <w:proofErr w:type="spellStart"/>
+      <w:proofErr w:type="gramStart"/>
+      <w:r>
+        <w:rPr>
+          <w:lang w:val="en-GB"/>
+        </w:rPr>
+        <w:t>set,multiset</w:t>
+      </w:r>
+      <w:proofErr w:type="spellEnd"/>
+      <w:proofErr w:type="gramEnd"/>
+      <w:r>
+        <w:rPr>
+          <w:lang w:val="en-GB"/>
+        </w:rPr>
+        <w:t>, map, multimap)</w:t>
       </w:r>
       <w:r>
         <w:rPr>
@@ -124,7 +176,13 @@
     </w:p>
     <w:p>
       <w:r>
-        <w:t>Servono principalmente per strutture sequenziali come liste o alberi (visto che pile o code accedi solo agli estremi).</w:t>
+        <w:t>Servono principalmente per strutture sequenziali come liste o alberi (visto che</w:t>
+      </w:r>
+      <w:r>
+        <w:t xml:space="preserve"> in</w:t>
+      </w:r>
+      <w:r>
+        <w:t xml:space="preserve"> pile o code accedi solo agli estremi).</w:t>
       </w:r>
     </w:p>
     <w:p/>
@@ -280,54 +338,2094 @@
         <w:t>;</w:t>
       </w:r>
     </w:p>
-    <w:p>
-      <w:r>
-        <w:t xml:space="preserve">acesso </w:t>
-      </w:r>
-      <w:r>
-        <w:rPr>
-          <w:u w:val="single"/>
-        </w:rPr>
-        <w:t>Bidirezionale</w:t>
-      </w:r>
-      <w:r>
-        <w:t xml:space="preserve"> (liste): supporta incremento e decremento.</w:t>
-      </w:r>
-    </w:p>
-    <w:p>
-      <w:r>
-        <w:t xml:space="preserve">acesso </w:t>
-      </w:r>
-      <w:r>
-        <w:rPr>
-          <w:u w:val="single"/>
-        </w:rPr>
-        <w:t>Casuale</w:t>
-      </w:r>
-      <w:r>
-        <w:t xml:space="preserve"> (vector, deque): spostamenti arbitrari, si può utilizzare l’aritmetica e il confronto di puntatori.</w:t>
-      </w:r>
-      <w:r>
-        <w:t xml:space="preserve"> </w:t>
-      </w:r>
-    </w:p>
-    <w:p/>
-    <w:p/>
-    <w:p/>
     <w:p/>
     <w:p>
       <w:pPr>
         <w:rPr>
           <w:b/>
           <w:bCs/>
-        </w:rPr>
-      </w:pPr>
-      <w:r>
+          <w:sz w:val="32"/>
+          <w:szCs w:val="32"/>
+        </w:rPr>
+      </w:pPr>
+    </w:p>
+    <w:p>
+      <w:pPr>
         <w:rPr>
           <w:b/>
           <w:bCs/>
+          <w:sz w:val="32"/>
+          <w:szCs w:val="32"/>
+        </w:rPr>
+      </w:pPr>
+    </w:p>
+    <w:p>
+      <w:pPr>
+        <w:rPr>
+          <w:b/>
+          <w:bCs/>
+          <w:sz w:val="32"/>
+          <w:szCs w:val="32"/>
+        </w:rPr>
+      </w:pPr>
+    </w:p>
+    <w:p>
+      <w:pPr>
+        <w:rPr>
+          <w:b/>
+          <w:bCs/>
+          <w:sz w:val="32"/>
+          <w:szCs w:val="32"/>
+        </w:rPr>
+      </w:pPr>
+    </w:p>
+    <w:p>
+      <w:pPr>
+        <w:rPr>
+          <w:b/>
+          <w:bCs/>
+          <w:sz w:val="32"/>
+          <w:szCs w:val="32"/>
+        </w:rPr>
+      </w:pPr>
+    </w:p>
+    <w:p>
+      <w:r>
+        <w:rPr>
+          <w:b/>
+          <w:bCs/>
+          <w:sz w:val="32"/>
+          <w:szCs w:val="32"/>
         </w:rPr>
         <w:lastRenderedPageBreak/>
+        <w:t>List</w:t>
+      </w:r>
+      <w:r>
+        <w:rPr>
+          <w:b/>
+          <w:bCs/>
+        </w:rPr>
+        <w:t xml:space="preserve"> </w:t>
+      </w:r>
+      <w:r>
+        <w:rPr>
+          <w:b/>
+          <w:bCs/>
+        </w:rPr>
+        <w:t>vs</w:t>
+      </w:r>
+      <w:r>
+        <w:rPr>
+          <w:b/>
+          <w:bCs/>
+          <w:sz w:val="18"/>
+          <w:szCs w:val="18"/>
+        </w:rPr>
+        <w:t xml:space="preserve"> </w:t>
+      </w:r>
+      <w:r>
+        <w:rPr>
+          <w:b/>
+          <w:bCs/>
+          <w:sz w:val="32"/>
+          <w:szCs w:val="32"/>
+        </w:rPr>
+        <w:t>Vector</w:t>
+      </w:r>
+    </w:p>
+    <w:tbl>
+      <w:tblPr>
+        <w:tblpPr w:leftFromText="180" w:rightFromText="180" w:vertAnchor="text" w:horzAnchor="margin" w:tblpY="284"/>
+        <w:tblW w:w="9773" w:type="dxa"/>
+        <w:tblCellSpacing w:w="15" w:type="dxa"/>
+        <w:tblCellMar>
+          <w:left w:w="0" w:type="dxa"/>
+          <w:right w:w="0" w:type="dxa"/>
+        </w:tblCellMar>
+        <w:tblLook w:val="04A0" w:firstRow="1" w:lastRow="0" w:firstColumn="1" w:lastColumn="0" w:noHBand="0" w:noVBand="1"/>
+      </w:tblPr>
+      <w:tblGrid>
+        <w:gridCol w:w="2030"/>
+        <w:gridCol w:w="3512"/>
+        <w:gridCol w:w="4231"/>
+      </w:tblGrid>
+      <w:tr>
+        <w:trPr>
+          <w:tblHeader/>
+          <w:tblCellSpacing w:w="15" w:type="dxa"/>
+        </w:trPr>
+        <w:tc>
+          <w:tcPr>
+            <w:tcW w:w="0" w:type="auto"/>
+            <w:tcBorders>
+              <w:top w:val="single" w:sz="6" w:space="0" w:color="C4C7C5"/>
+              <w:left w:val="single" w:sz="6" w:space="0" w:color="C4C7C5"/>
+              <w:bottom w:val="single" w:sz="6" w:space="0" w:color="C4C7C5"/>
+              <w:right w:val="single" w:sz="6" w:space="0" w:color="C4C7C5"/>
+            </w:tcBorders>
+            <w:tcMar>
+              <w:top w:w="120" w:type="dxa"/>
+              <w:left w:w="180" w:type="dxa"/>
+              <w:bottom w:w="120" w:type="dxa"/>
+              <w:right w:w="180" w:type="dxa"/>
+            </w:tcMar>
+            <w:vAlign w:val="center"/>
+            <w:hideMark/>
+          </w:tcPr>
+          <w:p>
+            <w:pPr>
+              <w:rPr>
+                <w:lang w:val="en-GB"/>
+              </w:rPr>
+            </w:pPr>
+            <w:proofErr w:type="spellStart"/>
+            <w:r>
+              <w:rPr>
+                <w:b/>
+                <w:bCs/>
+                <w:lang w:val="en-GB"/>
+              </w:rPr>
+              <w:t>Caratteristica</w:t>
+            </w:r>
+            <w:proofErr w:type="spellEnd"/>
+          </w:p>
+        </w:tc>
+        <w:tc>
+          <w:tcPr>
+            <w:tcW w:w="0" w:type="auto"/>
+            <w:tcBorders>
+              <w:top w:val="single" w:sz="6" w:space="0" w:color="C4C7C5"/>
+              <w:left w:val="single" w:sz="6" w:space="0" w:color="C4C7C5"/>
+              <w:bottom w:val="single" w:sz="6" w:space="0" w:color="C4C7C5"/>
+              <w:right w:val="single" w:sz="6" w:space="0" w:color="C4C7C5"/>
+            </w:tcBorders>
+            <w:tcMar>
+              <w:top w:w="120" w:type="dxa"/>
+              <w:left w:w="180" w:type="dxa"/>
+              <w:bottom w:w="120" w:type="dxa"/>
+              <w:right w:w="180" w:type="dxa"/>
+            </w:tcMar>
+            <w:vAlign w:val="center"/>
+            <w:hideMark/>
+          </w:tcPr>
+          <w:p>
+            <w:pPr>
+              <w:rPr>
+                <w:lang w:val="en-GB"/>
+              </w:rPr>
+            </w:pPr>
+            <w:proofErr w:type="gramStart"/>
+            <w:r>
+              <w:rPr>
+                <w:b/>
+                <w:bCs/>
+                <w:lang w:val="en-GB"/>
+              </w:rPr>
+              <w:t>std::</w:t>
+            </w:r>
+            <w:proofErr w:type="gramEnd"/>
+            <w:r>
+              <w:rPr>
+                <w:b/>
+                <w:bCs/>
+                <w:lang w:val="en-GB"/>
+              </w:rPr>
+              <w:t>vector</w:t>
+            </w:r>
+          </w:p>
+        </w:tc>
+        <w:tc>
+          <w:tcPr>
+            <w:tcW w:w="4186" w:type="dxa"/>
+            <w:tcBorders>
+              <w:top w:val="single" w:sz="6" w:space="0" w:color="C4C7C5"/>
+              <w:left w:val="single" w:sz="6" w:space="0" w:color="C4C7C5"/>
+              <w:bottom w:val="single" w:sz="6" w:space="0" w:color="C4C7C5"/>
+              <w:right w:val="single" w:sz="6" w:space="0" w:color="C4C7C5"/>
+            </w:tcBorders>
+            <w:tcMar>
+              <w:top w:w="120" w:type="dxa"/>
+              <w:left w:w="180" w:type="dxa"/>
+              <w:bottom w:w="120" w:type="dxa"/>
+              <w:right w:w="180" w:type="dxa"/>
+            </w:tcMar>
+            <w:vAlign w:val="center"/>
+            <w:hideMark/>
+          </w:tcPr>
+          <w:p>
+            <w:pPr>
+              <w:rPr>
+                <w:lang w:val="en-GB"/>
+              </w:rPr>
+            </w:pPr>
+            <w:proofErr w:type="gramStart"/>
+            <w:r>
+              <w:rPr>
+                <w:b/>
+                <w:bCs/>
+                <w:lang w:val="en-GB"/>
+              </w:rPr>
+              <w:t>std::</w:t>
+            </w:r>
+            <w:proofErr w:type="gramEnd"/>
+            <w:r>
+              <w:rPr>
+                <w:b/>
+                <w:bCs/>
+                <w:lang w:val="en-GB"/>
+              </w:rPr>
+              <w:t xml:space="preserve">list / </w:t>
+            </w:r>
+            <w:proofErr w:type="gramStart"/>
+            <w:r>
+              <w:rPr>
+                <w:b/>
+                <w:bCs/>
+                <w:lang w:val="en-GB"/>
+              </w:rPr>
+              <w:t>std::</w:t>
+            </w:r>
+            <w:proofErr w:type="spellStart"/>
+            <w:proofErr w:type="gramEnd"/>
+            <w:r>
+              <w:rPr>
+                <w:b/>
+                <w:bCs/>
+                <w:lang w:val="en-GB"/>
+              </w:rPr>
+              <w:t>forward_list</w:t>
+            </w:r>
+            <w:proofErr w:type="spellEnd"/>
+          </w:p>
+        </w:tc>
+      </w:tr>
+      <w:tr>
+        <w:trPr>
+          <w:tblCellSpacing w:w="15" w:type="dxa"/>
+        </w:trPr>
+        <w:tc>
+          <w:tcPr>
+            <w:tcW w:w="0" w:type="auto"/>
+            <w:tcBorders>
+              <w:top w:val="single" w:sz="6" w:space="0" w:color="C4C7C5"/>
+              <w:left w:val="single" w:sz="6" w:space="0" w:color="C4C7C5"/>
+              <w:bottom w:val="single" w:sz="6" w:space="0" w:color="C4C7C5"/>
+              <w:right w:val="single" w:sz="6" w:space="0" w:color="C4C7C5"/>
+            </w:tcBorders>
+            <w:tcMar>
+              <w:top w:w="120" w:type="dxa"/>
+              <w:left w:w="180" w:type="dxa"/>
+              <w:bottom w:w="120" w:type="dxa"/>
+              <w:right w:w="180" w:type="dxa"/>
+            </w:tcMar>
+            <w:vAlign w:val="center"/>
+            <w:hideMark/>
+          </w:tcPr>
+          <w:p>
+            <w:pPr>
+              <w:rPr>
+                <w:lang w:val="en-GB"/>
+              </w:rPr>
+            </w:pPr>
+            <w:proofErr w:type="spellStart"/>
+            <w:r>
+              <w:rPr>
+                <w:b/>
+                <w:bCs/>
+                <w:lang w:val="en-GB"/>
+              </w:rPr>
+              <w:t>Struttura</w:t>
+            </w:r>
+            <w:proofErr w:type="spellEnd"/>
+            <w:r>
+              <w:rPr>
+                <w:b/>
+                <w:bCs/>
+                <w:lang w:val="en-GB"/>
+              </w:rPr>
+              <w:t xml:space="preserve"> Interna</w:t>
+            </w:r>
+          </w:p>
+        </w:tc>
+        <w:tc>
+          <w:tcPr>
+            <w:tcW w:w="0" w:type="auto"/>
+            <w:tcBorders>
+              <w:top w:val="single" w:sz="6" w:space="0" w:color="C4C7C5"/>
+              <w:left w:val="single" w:sz="6" w:space="0" w:color="C4C7C5"/>
+              <w:bottom w:val="single" w:sz="6" w:space="0" w:color="C4C7C5"/>
+              <w:right w:val="single" w:sz="6" w:space="0" w:color="C4C7C5"/>
+            </w:tcBorders>
+            <w:tcMar>
+              <w:top w:w="120" w:type="dxa"/>
+              <w:left w:w="180" w:type="dxa"/>
+              <w:bottom w:w="120" w:type="dxa"/>
+              <w:right w:w="180" w:type="dxa"/>
+            </w:tcMar>
+            <w:vAlign w:val="center"/>
+            <w:hideMark/>
+          </w:tcPr>
+          <w:p>
+            <w:r>
+              <w:rPr>
+                <w:b/>
+                <w:bCs/>
+              </w:rPr>
+              <w:t>Array dinamico</w:t>
+            </w:r>
+            <w:r>
+              <w:t>. I dati sono salvati in un unico blocco di memoria contiguo</w:t>
+            </w:r>
+            <w:r>
+              <w:t xml:space="preserve"> </w:t>
+            </w:r>
+            <w:r>
+              <w:rPr>
+                <w:b/>
+                <w:bCs/>
+              </w:rPr>
+              <w:t>monodirezionale</w:t>
+            </w:r>
+            <w:r>
+              <w:t>.</w:t>
+            </w:r>
+          </w:p>
+        </w:tc>
+        <w:tc>
+          <w:tcPr>
+            <w:tcW w:w="4186" w:type="dxa"/>
+            <w:tcBorders>
+              <w:top w:val="single" w:sz="6" w:space="0" w:color="C4C7C5"/>
+              <w:left w:val="single" w:sz="6" w:space="0" w:color="C4C7C5"/>
+              <w:bottom w:val="single" w:sz="6" w:space="0" w:color="C4C7C5"/>
+              <w:right w:val="single" w:sz="6" w:space="0" w:color="C4C7C5"/>
+            </w:tcBorders>
+            <w:tcMar>
+              <w:top w:w="120" w:type="dxa"/>
+              <w:left w:w="180" w:type="dxa"/>
+              <w:bottom w:w="120" w:type="dxa"/>
+              <w:right w:w="180" w:type="dxa"/>
+            </w:tcMar>
+            <w:vAlign w:val="center"/>
+            <w:hideMark/>
+          </w:tcPr>
+          <w:p>
+            <w:r>
+              <w:rPr>
+                <w:b/>
+                <w:bCs/>
+              </w:rPr>
+              <w:t>Lista concatenata</w:t>
+            </w:r>
+            <w:r>
+              <w:t xml:space="preserve">. I dati sono "nodi" sparsi in memoria e collegati da puntatori. list è </w:t>
+            </w:r>
+            <w:r>
+              <w:rPr>
+                <w:b/>
+                <w:bCs/>
+              </w:rPr>
+              <w:t>bidirezionale</w:t>
+            </w:r>
+            <w:r>
+              <w:t xml:space="preserve"> (puntatore avanti e indietro). forward_list è </w:t>
+            </w:r>
+            <w:r>
+              <w:rPr>
+                <w:b/>
+                <w:bCs/>
+              </w:rPr>
+              <w:t>monodirezionale</w:t>
+            </w:r>
+            <w:r>
+              <w:t xml:space="preserve"> (solo avanti).</w:t>
+            </w:r>
+          </w:p>
+        </w:tc>
+      </w:tr>
+      <w:tr>
+        <w:trPr>
+          <w:tblCellSpacing w:w="15" w:type="dxa"/>
+        </w:trPr>
+        <w:tc>
+          <w:tcPr>
+            <w:tcW w:w="0" w:type="auto"/>
+            <w:tcBorders>
+              <w:top w:val="single" w:sz="6" w:space="0" w:color="C4C7C5"/>
+              <w:left w:val="single" w:sz="6" w:space="0" w:color="C4C7C5"/>
+              <w:bottom w:val="single" w:sz="6" w:space="0" w:color="C4C7C5"/>
+              <w:right w:val="single" w:sz="6" w:space="0" w:color="C4C7C5"/>
+            </w:tcBorders>
+            <w:tcMar>
+              <w:top w:w="120" w:type="dxa"/>
+              <w:left w:w="180" w:type="dxa"/>
+              <w:bottom w:w="120" w:type="dxa"/>
+              <w:right w:w="180" w:type="dxa"/>
+            </w:tcMar>
+            <w:vAlign w:val="center"/>
+            <w:hideMark/>
+          </w:tcPr>
+          <w:p>
+            <w:pPr>
+              <w:rPr>
+                <w:lang w:val="en-GB"/>
+              </w:rPr>
+            </w:pPr>
+            <w:r>
+              <w:rPr>
+                <w:b/>
+                <w:bCs/>
+                <w:lang w:val="en-GB"/>
+              </w:rPr>
+              <w:t xml:space="preserve">Accesso </w:t>
+            </w:r>
+            <w:proofErr w:type="spellStart"/>
+            <w:r>
+              <w:rPr>
+                <w:b/>
+                <w:bCs/>
+                <w:lang w:val="en-GB"/>
+              </w:rPr>
+              <w:t>Casuale</w:t>
+            </w:r>
+            <w:proofErr w:type="spellEnd"/>
+            <w:r>
+              <w:rPr>
+                <w:b/>
+                <w:bCs/>
+                <w:lang w:val="en-GB"/>
+              </w:rPr>
+              <w:t xml:space="preserve"> (es. </w:t>
+            </w:r>
+            <w:r>
+              <w:rPr>
+                <w:lang w:val="en-GB"/>
+              </w:rPr>
+              <w:t>[5]</w:t>
+            </w:r>
+            <w:r>
+              <w:rPr>
+                <w:b/>
+                <w:bCs/>
+                <w:lang w:val="en-GB"/>
+              </w:rPr>
+              <w:t>)</w:t>
+            </w:r>
+          </w:p>
+        </w:tc>
+        <w:tc>
+          <w:tcPr>
+            <w:tcW w:w="0" w:type="auto"/>
+            <w:tcBorders>
+              <w:top w:val="single" w:sz="6" w:space="0" w:color="C4C7C5"/>
+              <w:left w:val="single" w:sz="6" w:space="0" w:color="C4C7C5"/>
+              <w:bottom w:val="single" w:sz="6" w:space="0" w:color="C4C7C5"/>
+              <w:right w:val="single" w:sz="6" w:space="0" w:color="C4C7C5"/>
+            </w:tcBorders>
+            <w:tcMar>
+              <w:top w:w="120" w:type="dxa"/>
+              <w:left w:w="180" w:type="dxa"/>
+              <w:bottom w:w="120" w:type="dxa"/>
+              <w:right w:w="180" w:type="dxa"/>
+            </w:tcMar>
+            <w:vAlign w:val="center"/>
+            <w:hideMark/>
+          </w:tcPr>
+          <w:p>
+            <w:r>
+              <w:rPr>
+                <w:b/>
+                <w:bCs/>
+              </w:rPr>
+              <w:t>SÌ ($O(1)$)</w:t>
+            </w:r>
+            <w:r>
+              <w:t>. Accesso istantaneo tramite indice numerico.</w:t>
+            </w:r>
+          </w:p>
+        </w:tc>
+        <w:tc>
+          <w:tcPr>
+            <w:tcW w:w="4186" w:type="dxa"/>
+            <w:tcBorders>
+              <w:top w:val="single" w:sz="6" w:space="0" w:color="C4C7C5"/>
+              <w:left w:val="single" w:sz="6" w:space="0" w:color="C4C7C5"/>
+              <w:bottom w:val="single" w:sz="6" w:space="0" w:color="C4C7C5"/>
+              <w:right w:val="single" w:sz="6" w:space="0" w:color="C4C7C5"/>
+            </w:tcBorders>
+            <w:tcMar>
+              <w:top w:w="120" w:type="dxa"/>
+              <w:left w:w="180" w:type="dxa"/>
+              <w:bottom w:w="120" w:type="dxa"/>
+              <w:right w:w="180" w:type="dxa"/>
+            </w:tcMar>
+            <w:vAlign w:val="center"/>
+            <w:hideMark/>
+          </w:tcPr>
+          <w:p>
+            <w:r>
+              <w:rPr>
+                <w:b/>
+                <w:bCs/>
+              </w:rPr>
+              <w:t>NO ($O(n)$)</w:t>
+            </w:r>
+            <w:r>
+              <w:t>. L'operatore [] non esiste. Per arrivare al 5° elemento, devi partire dall'inizio e "saltare" di nodo in nodo usando un iteratore.</w:t>
+            </w:r>
+          </w:p>
+        </w:tc>
+      </w:tr>
+      <w:tr>
+        <w:trPr>
+          <w:tblCellSpacing w:w="15" w:type="dxa"/>
+        </w:trPr>
+        <w:tc>
+          <w:tcPr>
+            <w:tcW w:w="0" w:type="auto"/>
+            <w:tcBorders>
+              <w:top w:val="single" w:sz="6" w:space="0" w:color="C4C7C5"/>
+              <w:left w:val="single" w:sz="6" w:space="0" w:color="C4C7C5"/>
+              <w:bottom w:val="single" w:sz="6" w:space="0" w:color="C4C7C5"/>
+              <w:right w:val="single" w:sz="6" w:space="0" w:color="C4C7C5"/>
+            </w:tcBorders>
+            <w:tcMar>
+              <w:top w:w="120" w:type="dxa"/>
+              <w:left w:w="180" w:type="dxa"/>
+              <w:bottom w:w="120" w:type="dxa"/>
+              <w:right w:w="180" w:type="dxa"/>
+            </w:tcMar>
+            <w:vAlign w:val="center"/>
+            <w:hideMark/>
+          </w:tcPr>
+          <w:p>
+            <w:pPr>
+              <w:rPr>
+                <w:lang w:val="en-GB"/>
+              </w:rPr>
+            </w:pPr>
+            <w:proofErr w:type="spellStart"/>
+            <w:r>
+              <w:rPr>
+                <w:b/>
+                <w:bCs/>
+                <w:lang w:val="en-GB"/>
+              </w:rPr>
+              <w:t>Operazioni</w:t>
+            </w:r>
+            <w:proofErr w:type="spellEnd"/>
+            <w:r>
+              <w:rPr>
+                <w:b/>
+                <w:bCs/>
+                <w:lang w:val="en-GB"/>
+              </w:rPr>
+              <w:t xml:space="preserve"> in Coda / Testa</w:t>
+            </w:r>
+          </w:p>
+        </w:tc>
+        <w:tc>
+          <w:tcPr>
+            <w:tcW w:w="0" w:type="auto"/>
+            <w:tcBorders>
+              <w:top w:val="single" w:sz="6" w:space="0" w:color="C4C7C5"/>
+              <w:left w:val="single" w:sz="6" w:space="0" w:color="C4C7C5"/>
+              <w:bottom w:val="single" w:sz="6" w:space="0" w:color="C4C7C5"/>
+              <w:right w:val="single" w:sz="6" w:space="0" w:color="C4C7C5"/>
+            </w:tcBorders>
+            <w:tcMar>
+              <w:top w:w="120" w:type="dxa"/>
+              <w:left w:w="180" w:type="dxa"/>
+              <w:bottom w:w="120" w:type="dxa"/>
+              <w:right w:w="180" w:type="dxa"/>
+            </w:tcMar>
+            <w:vAlign w:val="center"/>
+            <w:hideMark/>
+          </w:tcPr>
+          <w:p>
+            <w:r>
+              <w:rPr>
+                <w:b/>
+                <w:bCs/>
+              </w:rPr>
+              <w:t>Coda: Eccellente ($O(1)$ ammortizzato)</w:t>
+            </w:r>
+            <w:r>
+              <w:t>.</w:t>
+            </w:r>
+          </w:p>
+          <w:p>
+            <w:r>
+              <w:br/>
+            </w:r>
+          </w:p>
+          <w:p>
+            <w:r>
+              <w:rPr>
+                <w:b/>
+                <w:bCs/>
+              </w:rPr>
+              <w:t>Testa: Pessimo ($O(n)$)</w:t>
+            </w:r>
+            <w:r>
+              <w:t>.</w:t>
+            </w:r>
+          </w:p>
+        </w:tc>
+        <w:tc>
+          <w:tcPr>
+            <w:tcW w:w="4186" w:type="dxa"/>
+            <w:tcBorders>
+              <w:top w:val="single" w:sz="6" w:space="0" w:color="C4C7C5"/>
+              <w:left w:val="single" w:sz="6" w:space="0" w:color="C4C7C5"/>
+              <w:bottom w:val="single" w:sz="6" w:space="0" w:color="C4C7C5"/>
+              <w:right w:val="single" w:sz="6" w:space="0" w:color="C4C7C5"/>
+            </w:tcBorders>
+            <w:tcMar>
+              <w:top w:w="120" w:type="dxa"/>
+              <w:left w:w="180" w:type="dxa"/>
+              <w:bottom w:w="120" w:type="dxa"/>
+              <w:right w:w="180" w:type="dxa"/>
+            </w:tcMar>
+            <w:vAlign w:val="center"/>
+            <w:hideMark/>
+          </w:tcPr>
+          <w:p>
+            <w:r>
+              <w:rPr>
+                <w:b/>
+                <w:bCs/>
+              </w:rPr>
+              <w:t>Coda: Eccellente ($O(1)$)</w:t>
+            </w:r>
+            <w:r>
+              <w:t>.</w:t>
+            </w:r>
+          </w:p>
+          <w:p>
+            <w:r>
+              <w:br/>
+            </w:r>
+          </w:p>
+          <w:p>
+            <w:r>
+              <w:rPr>
+                <w:b/>
+                <w:bCs/>
+              </w:rPr>
+              <w:t>Testa: Eccellente ($O(1)$)</w:t>
+            </w:r>
+            <w:r>
+              <w:t>.</w:t>
+            </w:r>
+          </w:p>
+        </w:tc>
+      </w:tr>
+      <w:tr>
+        <w:trPr>
+          <w:tblCellSpacing w:w="15" w:type="dxa"/>
+        </w:trPr>
+        <w:tc>
+          <w:tcPr>
+            <w:tcW w:w="0" w:type="auto"/>
+            <w:tcBorders>
+              <w:top w:val="single" w:sz="6" w:space="0" w:color="C4C7C5"/>
+              <w:left w:val="single" w:sz="6" w:space="0" w:color="C4C7C5"/>
+              <w:bottom w:val="single" w:sz="6" w:space="0" w:color="C4C7C5"/>
+              <w:right w:val="single" w:sz="6" w:space="0" w:color="C4C7C5"/>
+            </w:tcBorders>
+            <w:tcMar>
+              <w:top w:w="120" w:type="dxa"/>
+              <w:left w:w="180" w:type="dxa"/>
+              <w:bottom w:w="120" w:type="dxa"/>
+              <w:right w:w="180" w:type="dxa"/>
+            </w:tcMar>
+            <w:vAlign w:val="center"/>
+            <w:hideMark/>
+          </w:tcPr>
+          <w:p>
+            <w:pPr>
+              <w:rPr>
+                <w:lang w:val="en-GB"/>
+              </w:rPr>
+            </w:pPr>
+            <w:proofErr w:type="spellStart"/>
+            <w:r>
+              <w:rPr>
+                <w:b/>
+                <w:bCs/>
+                <w:lang w:val="en-GB"/>
+              </w:rPr>
+              <w:t>Operazioni</w:t>
+            </w:r>
+            <w:proofErr w:type="spellEnd"/>
+            <w:r>
+              <w:rPr>
+                <w:b/>
+                <w:bCs/>
+                <w:lang w:val="en-GB"/>
+              </w:rPr>
+              <w:t xml:space="preserve"> in Mezzo</w:t>
+            </w:r>
+          </w:p>
+        </w:tc>
+        <w:tc>
+          <w:tcPr>
+            <w:tcW w:w="0" w:type="auto"/>
+            <w:tcBorders>
+              <w:top w:val="single" w:sz="6" w:space="0" w:color="C4C7C5"/>
+              <w:left w:val="single" w:sz="6" w:space="0" w:color="C4C7C5"/>
+              <w:bottom w:val="single" w:sz="6" w:space="0" w:color="C4C7C5"/>
+              <w:right w:val="single" w:sz="6" w:space="0" w:color="C4C7C5"/>
+            </w:tcBorders>
+            <w:tcMar>
+              <w:top w:w="120" w:type="dxa"/>
+              <w:left w:w="180" w:type="dxa"/>
+              <w:bottom w:w="120" w:type="dxa"/>
+              <w:right w:w="180" w:type="dxa"/>
+            </w:tcMar>
+            <w:vAlign w:val="center"/>
+            <w:hideMark/>
+          </w:tcPr>
+          <w:p>
+            <w:r>
+              <w:rPr>
+                <w:b/>
+                <w:bCs/>
+              </w:rPr>
+              <w:t>Lento ($O(n)$)</w:t>
+            </w:r>
+            <w:r>
+              <w:t>. Per inserire o rimuovere un elemento al centro, il processore deve spostare fisicamente di una posizione tutti gli elementi successivi.</w:t>
+            </w:r>
+          </w:p>
+        </w:tc>
+        <w:tc>
+          <w:tcPr>
+            <w:tcW w:w="4186" w:type="dxa"/>
+            <w:tcBorders>
+              <w:top w:val="single" w:sz="6" w:space="0" w:color="C4C7C5"/>
+              <w:left w:val="single" w:sz="6" w:space="0" w:color="C4C7C5"/>
+              <w:bottom w:val="single" w:sz="6" w:space="0" w:color="C4C7C5"/>
+              <w:right w:val="single" w:sz="6" w:space="0" w:color="C4C7C5"/>
+            </w:tcBorders>
+            <w:tcMar>
+              <w:top w:w="120" w:type="dxa"/>
+              <w:left w:w="180" w:type="dxa"/>
+              <w:bottom w:w="120" w:type="dxa"/>
+              <w:right w:w="180" w:type="dxa"/>
+            </w:tcMar>
+            <w:vAlign w:val="center"/>
+            <w:hideMark/>
+          </w:tcPr>
+          <w:p>
+            <w:r>
+              <w:rPr>
+                <w:b/>
+                <w:bCs/>
+              </w:rPr>
+              <w:t>Eccellente ($O(1)$)</w:t>
+            </w:r>
+            <w:r>
+              <w:t>. Non si sposta nessun dato in memoria; basta "scollegare" e "ricollegare" 1 o 2 puntatori (a patto di avere già l'iteratore in quella posizione).</w:t>
+            </w:r>
+          </w:p>
+        </w:tc>
+      </w:tr>
+      <w:tr>
+        <w:trPr>
+          <w:tblCellSpacing w:w="15" w:type="dxa"/>
+        </w:trPr>
+        <w:tc>
+          <w:tcPr>
+            <w:tcW w:w="0" w:type="auto"/>
+            <w:tcBorders>
+              <w:top w:val="single" w:sz="6" w:space="0" w:color="C4C7C5"/>
+              <w:left w:val="single" w:sz="6" w:space="0" w:color="C4C7C5"/>
+              <w:bottom w:val="single" w:sz="6" w:space="0" w:color="C4C7C5"/>
+              <w:right w:val="single" w:sz="6" w:space="0" w:color="C4C7C5"/>
+            </w:tcBorders>
+            <w:tcMar>
+              <w:top w:w="120" w:type="dxa"/>
+              <w:left w:w="180" w:type="dxa"/>
+              <w:bottom w:w="120" w:type="dxa"/>
+              <w:right w:w="180" w:type="dxa"/>
+            </w:tcMar>
+            <w:vAlign w:val="center"/>
+            <w:hideMark/>
+          </w:tcPr>
+          <w:p>
+            <w:pPr>
+              <w:rPr>
+                <w:lang w:val="en-GB"/>
+              </w:rPr>
+            </w:pPr>
+            <w:proofErr w:type="spellStart"/>
+            <w:r>
+              <w:rPr>
+                <w:b/>
+                <w:bCs/>
+                <w:lang w:val="en-GB"/>
+              </w:rPr>
+              <w:t>Gestione</w:t>
+            </w:r>
+            <w:proofErr w:type="spellEnd"/>
+            <w:r>
+              <w:rPr>
+                <w:b/>
+                <w:bCs/>
+                <w:lang w:val="en-GB"/>
+              </w:rPr>
+              <w:t xml:space="preserve"> Memoria</w:t>
+            </w:r>
+          </w:p>
+        </w:tc>
+        <w:tc>
+          <w:tcPr>
+            <w:tcW w:w="0" w:type="auto"/>
+            <w:tcBorders>
+              <w:top w:val="single" w:sz="6" w:space="0" w:color="C4C7C5"/>
+              <w:left w:val="single" w:sz="6" w:space="0" w:color="C4C7C5"/>
+              <w:bottom w:val="single" w:sz="6" w:space="0" w:color="C4C7C5"/>
+              <w:right w:val="single" w:sz="6" w:space="0" w:color="C4C7C5"/>
+            </w:tcBorders>
+            <w:tcMar>
+              <w:top w:w="120" w:type="dxa"/>
+              <w:left w:w="180" w:type="dxa"/>
+              <w:bottom w:w="120" w:type="dxa"/>
+              <w:right w:w="180" w:type="dxa"/>
+            </w:tcMar>
+            <w:vAlign w:val="center"/>
+            <w:hideMark/>
+          </w:tcPr>
+          <w:p>
+            <w:r>
+              <w:t xml:space="preserve">Occupa solo la memoria strettamente necessaria per i dati. Tuttavia, se si riempie, deve trovare un blocco di memoria più grande, copiare </w:t>
+            </w:r>
+            <w:r>
+              <w:rPr>
+                <w:i/>
+                <w:iCs/>
+              </w:rPr>
+              <w:lastRenderedPageBreak/>
+              <w:t>tutto</w:t>
+            </w:r>
+            <w:r>
+              <w:t xml:space="preserve"> il vecchio array e cancellarlo (riallocazione).</w:t>
+            </w:r>
+          </w:p>
+        </w:tc>
+        <w:tc>
+          <w:tcPr>
+            <w:tcW w:w="4186" w:type="dxa"/>
+            <w:tcBorders>
+              <w:top w:val="single" w:sz="6" w:space="0" w:color="C4C7C5"/>
+              <w:left w:val="single" w:sz="6" w:space="0" w:color="C4C7C5"/>
+              <w:bottom w:val="single" w:sz="6" w:space="0" w:color="C4C7C5"/>
+              <w:right w:val="single" w:sz="6" w:space="0" w:color="C4C7C5"/>
+            </w:tcBorders>
+            <w:tcMar>
+              <w:top w:w="120" w:type="dxa"/>
+              <w:left w:w="180" w:type="dxa"/>
+              <w:bottom w:w="120" w:type="dxa"/>
+              <w:right w:w="180" w:type="dxa"/>
+            </w:tcMar>
+            <w:vAlign w:val="center"/>
+            <w:hideMark/>
+          </w:tcPr>
+          <w:p>
+            <w:pPr>
+              <w:rPr>
+                <w:lang w:val="en-GB"/>
+              </w:rPr>
+            </w:pPr>
+            <w:r>
+              <w:lastRenderedPageBreak/>
+              <w:t xml:space="preserve">Ogni elemento occupa </w:t>
+            </w:r>
+            <w:r>
+              <w:rPr>
+                <w:b/>
+                <w:bCs/>
+              </w:rPr>
+              <w:t>più memoria</w:t>
+            </w:r>
+            <w:r>
+              <w:t xml:space="preserve"> del necessario, perché oltre al dato deve salvare 1 o 2 puntatori (indirizzi di memoria) per agganciarsi al resto della lista. </w:t>
+            </w:r>
+            <w:proofErr w:type="spellStart"/>
+            <w:r>
+              <w:rPr>
+                <w:lang w:val="en-GB"/>
+              </w:rPr>
+              <w:t>Nessuna</w:t>
+            </w:r>
+            <w:proofErr w:type="spellEnd"/>
+            <w:r>
+              <w:rPr>
+                <w:lang w:val="en-GB"/>
+              </w:rPr>
+              <w:t xml:space="preserve"> </w:t>
+            </w:r>
+            <w:proofErr w:type="spellStart"/>
+            <w:r>
+              <w:rPr>
+                <w:lang w:val="en-GB"/>
+              </w:rPr>
+              <w:t>riallocazione</w:t>
+            </w:r>
+            <w:proofErr w:type="spellEnd"/>
+            <w:r>
+              <w:rPr>
+                <w:lang w:val="en-GB"/>
+              </w:rPr>
+              <w:t xml:space="preserve"> </w:t>
+            </w:r>
+            <w:proofErr w:type="spellStart"/>
+            <w:r>
+              <w:rPr>
+                <w:lang w:val="en-GB"/>
+              </w:rPr>
+              <w:t>globale</w:t>
+            </w:r>
+            <w:proofErr w:type="spellEnd"/>
+            <w:r>
+              <w:rPr>
+                <w:lang w:val="en-GB"/>
+              </w:rPr>
+              <w:t>.</w:t>
+            </w:r>
+          </w:p>
+        </w:tc>
+      </w:tr>
+      <w:tr>
+        <w:trPr>
+          <w:tblCellSpacing w:w="15" w:type="dxa"/>
+        </w:trPr>
+        <w:tc>
+          <w:tcPr>
+            <w:tcW w:w="0" w:type="auto"/>
+            <w:tcBorders>
+              <w:top w:val="single" w:sz="6" w:space="0" w:color="C4C7C5"/>
+              <w:left w:val="single" w:sz="6" w:space="0" w:color="C4C7C5"/>
+              <w:bottom w:val="single" w:sz="6" w:space="0" w:color="C4C7C5"/>
+              <w:right w:val="single" w:sz="6" w:space="0" w:color="C4C7C5"/>
+            </w:tcBorders>
+            <w:tcMar>
+              <w:top w:w="120" w:type="dxa"/>
+              <w:left w:w="180" w:type="dxa"/>
+              <w:bottom w:w="120" w:type="dxa"/>
+              <w:right w:w="180" w:type="dxa"/>
+            </w:tcMar>
+            <w:vAlign w:val="center"/>
+            <w:hideMark/>
+          </w:tcPr>
+          <w:p>
+            <w:pPr>
+              <w:rPr>
+                <w:lang w:val="en-GB"/>
+              </w:rPr>
+            </w:pPr>
+            <w:proofErr w:type="spellStart"/>
+            <w:r>
+              <w:rPr>
+                <w:b/>
+                <w:bCs/>
+                <w:lang w:val="en-GB"/>
+              </w:rPr>
+              <w:lastRenderedPageBreak/>
+              <w:t>Interazione</w:t>
+            </w:r>
+            <w:proofErr w:type="spellEnd"/>
+            <w:r>
+              <w:rPr>
+                <w:b/>
+                <w:bCs/>
+                <w:lang w:val="en-GB"/>
+              </w:rPr>
+              <w:t xml:space="preserve"> con la CPU</w:t>
+            </w:r>
+          </w:p>
+        </w:tc>
+        <w:tc>
+          <w:tcPr>
+            <w:tcW w:w="0" w:type="auto"/>
+            <w:tcBorders>
+              <w:top w:val="single" w:sz="6" w:space="0" w:color="C4C7C5"/>
+              <w:left w:val="single" w:sz="6" w:space="0" w:color="C4C7C5"/>
+              <w:bottom w:val="single" w:sz="6" w:space="0" w:color="C4C7C5"/>
+              <w:right w:val="single" w:sz="6" w:space="0" w:color="C4C7C5"/>
+            </w:tcBorders>
+            <w:tcMar>
+              <w:top w:w="120" w:type="dxa"/>
+              <w:left w:w="180" w:type="dxa"/>
+              <w:bottom w:w="120" w:type="dxa"/>
+              <w:right w:w="180" w:type="dxa"/>
+            </w:tcMar>
+            <w:vAlign w:val="center"/>
+            <w:hideMark/>
+          </w:tcPr>
+          <w:p>
+            <w:r>
+              <w:rPr>
+                <w:b/>
+                <w:bCs/>
+              </w:rPr>
+              <w:t>Estremamente "Cache-Friendly"</w:t>
+            </w:r>
+            <w:r>
+              <w:t>. Poiché i dati sono vicini, la CPU li carica in blocco ed esegue i cicli for in modo fulmineo.</w:t>
+            </w:r>
+          </w:p>
+        </w:tc>
+        <w:tc>
+          <w:tcPr>
+            <w:tcW w:w="4186" w:type="dxa"/>
+            <w:tcBorders>
+              <w:top w:val="single" w:sz="6" w:space="0" w:color="C4C7C5"/>
+              <w:left w:val="single" w:sz="6" w:space="0" w:color="C4C7C5"/>
+              <w:bottom w:val="single" w:sz="6" w:space="0" w:color="C4C7C5"/>
+              <w:right w:val="single" w:sz="6" w:space="0" w:color="C4C7C5"/>
+            </w:tcBorders>
+            <w:tcMar>
+              <w:top w:w="120" w:type="dxa"/>
+              <w:left w:w="180" w:type="dxa"/>
+              <w:bottom w:w="120" w:type="dxa"/>
+              <w:right w:w="180" w:type="dxa"/>
+            </w:tcMar>
+            <w:vAlign w:val="center"/>
+            <w:hideMark/>
+          </w:tcPr>
+          <w:p>
+            <w:r>
+              <w:rPr>
+                <w:b/>
+                <w:bCs/>
+              </w:rPr>
+              <w:t>Non Cache-Friendly</w:t>
+            </w:r>
+            <w:r>
+              <w:t>. Poiché i nodi sono in posizioni casuali nella RAM, la CPU subisce continui rallentamenti ("cache miss") per andarli a cercare.</w:t>
+            </w:r>
+          </w:p>
+        </w:tc>
+      </w:tr>
+    </w:tbl>
+    <w:p>
+      <w:r>
+        <w:t xml:space="preserve">Per precisione, il C++ offre due tipi di liste: std::list (che è </w:t>
+      </w:r>
+      <w:r>
+        <w:rPr>
+          <w:b/>
+          <w:bCs/>
+        </w:rPr>
+        <w:t>bidirezionale</w:t>
+      </w:r>
+      <w:r>
+        <w:t xml:space="preserve">) e std::forward_list (che è </w:t>
+      </w:r>
+      <w:r>
+        <w:rPr>
+          <w:b/>
+          <w:bCs/>
+        </w:rPr>
+        <w:t>monodirezionale</w:t>
+      </w:r>
+      <w:r>
+        <w:t>).</w:t>
+      </w:r>
+    </w:p>
+    <w:p>
+      <w:pPr>
+        <w:rPr>
+          <w:b/>
+          <w:bCs/>
+        </w:rPr>
+      </w:pPr>
+      <w:r>
+        <w:rPr>
+          <w:b/>
+          <w:bCs/>
+        </w:rPr>
+        <w:t>Quando scegliere l'uno o l'altro? (Il verdetto pratico)</w:t>
+      </w:r>
+    </w:p>
+    <w:p>
+      <w:pPr>
+        <w:numPr>
+          <w:ilvl w:val="0"/>
+          <w:numId w:val="3"/>
+        </w:numPr>
+      </w:pPr>
+      <w:r>
+        <w:rPr>
+          <w:b/>
+          <w:bCs/>
+        </w:rPr>
+        <w:t xml:space="preserve">Usa SEMPRE </w:t>
+      </w:r>
+      <w:r>
+        <w:t>std::vector</w:t>
+      </w:r>
+      <w:r>
+        <w:rPr>
+          <w:b/>
+          <w:bCs/>
+        </w:rPr>
+        <w:t xml:space="preserve"> come prima scelta.</w:t>
+      </w:r>
+    </w:p>
+    <w:p>
+      <w:r>
+        <w:t>Nella vita reale e nei software moderni, l'efficienza della CPU nel leggere blocchi di memoria contigui (cache-friendly) rende il vector infinitamente più veloce della lista nel 95% delle situazioni, anche se fai qualche inserimento in mezzo.</w:t>
+      </w:r>
+    </w:p>
+    <w:p>
+      <w:pPr>
+        <w:numPr>
+          <w:ilvl w:val="0"/>
+          <w:numId w:val="3"/>
+        </w:numPr>
+      </w:pPr>
+      <w:r>
+        <w:rPr>
+          <w:b/>
+          <w:bCs/>
+        </w:rPr>
+        <w:t xml:space="preserve">Usa </w:t>
+      </w:r>
+      <w:r>
+        <w:t>std::list</w:t>
+      </w:r>
+      <w:r>
+        <w:rPr>
+          <w:b/>
+          <w:bCs/>
+        </w:rPr>
+        <w:t xml:space="preserve"> solo in scenari molto specifici:</w:t>
+      </w:r>
+    </w:p>
+    <w:p>
+      <w:pPr>
+        <w:numPr>
+          <w:ilvl w:val="1"/>
+          <w:numId w:val="3"/>
+        </w:numPr>
+      </w:pPr>
+      <w:r>
+        <w:t xml:space="preserve">Quando hai una collezione di </w:t>
+      </w:r>
+      <w:r>
+        <w:rPr>
+          <w:b/>
+          <w:bCs/>
+        </w:rPr>
+        <w:t>dati molto "pesanti"</w:t>
+      </w:r>
+      <w:r>
+        <w:t xml:space="preserve"> (oggetti enormi) in cui lo spostamento in memoria (vector) costerebbe troppa potenza di calcolo.</w:t>
+      </w:r>
+    </w:p>
+    <w:p>
+      <w:pPr>
+        <w:numPr>
+          <w:ilvl w:val="1"/>
+          <w:numId w:val="3"/>
+        </w:numPr>
+      </w:pPr>
+      <w:r>
+        <w:t xml:space="preserve">Quando fai </w:t>
+      </w:r>
+      <w:r>
+        <w:rPr>
+          <w:b/>
+          <w:bCs/>
+        </w:rPr>
+        <w:t>costantemente e unicamente</w:t>
+      </w:r>
+      <w:r>
+        <w:t xml:space="preserve"> inserimenti e rimozioni casuali in mezzo a contenitori giganteschi.</w:t>
+      </w:r>
+    </w:p>
+    <w:p>
+      <w:pPr>
+        <w:numPr>
+          <w:ilvl w:val="1"/>
+          <w:numId w:val="3"/>
+        </w:numPr>
+      </w:pPr>
+      <w:r>
+        <w:t>Quando hai bisogno di garantire che i puntatori a un elemento restino sempre validi per tutta l'esecuzione (in un vector, se avviene una riallocazione, tutti i puntatori e iteratori vecchi diventano invalidi e fanno crashare il programma).</w:t>
+      </w:r>
+    </w:p>
+    <w:p/>
+    <w:p>
+      <w:pPr>
+        <w:autoSpaceDE w:val="0"/>
+        <w:autoSpaceDN w:val="0"/>
+        <w:adjustRightInd w:val="0"/>
+        <w:spacing w:after="0" w:line="240" w:lineRule="auto"/>
+        <w:rPr>
+          <w:rFonts w:ascii="Cascadia Mono" w:hAnsi="Cascadia Mono" w:cs="Cascadia Mono"/>
+          <w:color w:val="000000"/>
+          <w:kern w:val="0"/>
+          <w:sz w:val="19"/>
+          <w:szCs w:val="19"/>
+          <w:highlight w:val="white"/>
+        </w:rPr>
+      </w:pPr>
+      <w:r>
+        <w:rPr>
+          <w:u w:val="single"/>
+        </w:rPr>
+        <w:t>Le strutture sequenziali non supportano find perà si può comunque fare:</w:t>
+      </w:r>
+      <w:r>
+        <w:rPr>
+          <w:u w:val="single"/>
+        </w:rPr>
+        <w:br/>
+      </w:r>
+      <w:r>
+        <w:rPr>
+          <w:rFonts w:ascii="Cascadia Mono" w:hAnsi="Cascadia Mono" w:cs="Cascadia Mono"/>
+          <w:color w:val="000000"/>
+          <w:kern w:val="0"/>
+          <w:sz w:val="19"/>
+          <w:szCs w:val="19"/>
+          <w:highlight w:val="white"/>
+        </w:rPr>
+        <w:tab/>
+      </w:r>
+      <w:r>
+        <w:rPr>
+          <w:rFonts w:ascii="Cascadia Mono" w:hAnsi="Cascadia Mono" w:cs="Cascadia Mono"/>
+          <w:color w:val="2B91AF"/>
+          <w:kern w:val="0"/>
+          <w:sz w:val="19"/>
+          <w:szCs w:val="19"/>
+          <w:highlight w:val="white"/>
+        </w:rPr>
+        <w:t>vector</w:t>
+      </w:r>
+      <w:r>
+        <w:rPr>
+          <w:rFonts w:ascii="Cascadia Mono" w:hAnsi="Cascadia Mono" w:cs="Cascadia Mono"/>
+          <w:color w:val="000000"/>
+          <w:kern w:val="0"/>
+          <w:sz w:val="19"/>
+          <w:szCs w:val="19"/>
+          <w:highlight w:val="white"/>
+        </w:rPr>
+        <w:t>&lt;</w:t>
+      </w:r>
+      <w:r>
+        <w:rPr>
+          <w:rFonts w:ascii="Cascadia Mono" w:hAnsi="Cascadia Mono" w:cs="Cascadia Mono"/>
+          <w:color w:val="0000FF"/>
+          <w:kern w:val="0"/>
+          <w:sz w:val="19"/>
+          <w:szCs w:val="19"/>
+          <w:highlight w:val="white"/>
+        </w:rPr>
+        <w:t>int</w:t>
+      </w:r>
+      <w:r>
+        <w:rPr>
+          <w:rFonts w:ascii="Cascadia Mono" w:hAnsi="Cascadia Mono" w:cs="Cascadia Mono"/>
+          <w:color w:val="000000"/>
+          <w:kern w:val="0"/>
+          <w:sz w:val="19"/>
+          <w:szCs w:val="19"/>
+          <w:highlight w:val="white"/>
+        </w:rPr>
+        <w:t>&gt;::</w:t>
+      </w:r>
+      <w:r>
+        <w:rPr>
+          <w:rFonts w:ascii="Cascadia Mono" w:hAnsi="Cascadia Mono" w:cs="Cascadia Mono"/>
+          <w:color w:val="2B91AF"/>
+          <w:kern w:val="0"/>
+          <w:sz w:val="19"/>
+          <w:szCs w:val="19"/>
+          <w:highlight w:val="white"/>
+        </w:rPr>
+        <w:t>iterator</w:t>
+      </w:r>
+      <w:r>
+        <w:rPr>
+          <w:rFonts w:ascii="Cascadia Mono" w:hAnsi="Cascadia Mono" w:cs="Cascadia Mono"/>
+          <w:color w:val="000000"/>
+          <w:kern w:val="0"/>
+          <w:sz w:val="19"/>
+          <w:szCs w:val="19"/>
+          <w:highlight w:val="white"/>
+        </w:rPr>
+        <w:t xml:space="preserve"> it = (find(vect.begin(), vect.end(), 7));</w:t>
+      </w:r>
+    </w:p>
+    <w:p>
+      <w:pPr>
+        <w:autoSpaceDE w:val="0"/>
+        <w:autoSpaceDN w:val="0"/>
+        <w:adjustRightInd w:val="0"/>
+        <w:spacing w:after="0" w:line="240" w:lineRule="auto"/>
+        <w:rPr>
+          <w:rFonts w:ascii="Cascadia Mono" w:hAnsi="Cascadia Mono" w:cs="Cascadia Mono"/>
+          <w:color w:val="000000"/>
+          <w:kern w:val="0"/>
+          <w:sz w:val="19"/>
+          <w:szCs w:val="19"/>
+          <w:highlight w:val="white"/>
+          <w:lang w:val="en-GB"/>
+        </w:rPr>
+      </w:pPr>
+      <w:r>
+        <w:rPr>
+          <w:rFonts w:ascii="Cascadia Mono" w:hAnsi="Cascadia Mono" w:cs="Cascadia Mono"/>
+          <w:noProof/>
+          <w:color w:val="000000"/>
+          <w:kern w:val="0"/>
+          <w:sz w:val="19"/>
+          <w:szCs w:val="19"/>
+        </w:rPr>
+        <mc:AlternateContent>
+          <mc:Choice Requires="wps">
+            <w:drawing>
+              <wp:anchor distT="0" distB="0" distL="114300" distR="114300" simplePos="0" relativeHeight="251659264" behindDoc="0" locked="0" layoutInCell="1" allowOverlap="1" wp14:anchorId="2D5F480A" wp14:editId="5B378C88">
+                <wp:simplePos x="0" y="0"/>
+                <wp:positionH relativeFrom="column">
+                  <wp:posOffset>2615045</wp:posOffset>
+                </wp:positionH>
+                <wp:positionV relativeFrom="paragraph">
+                  <wp:posOffset>45951</wp:posOffset>
+                </wp:positionV>
+                <wp:extent cx="1527464" cy="406977"/>
+                <wp:effectExtent l="38100" t="57150" r="15875" b="31750"/>
+                <wp:wrapNone/>
+                <wp:docPr id="1274076489" name="Straight Arrow Connector 1"/>
+                <wp:cNvGraphicFramePr/>
+                <a:graphic xmlns:a="http://schemas.openxmlformats.org/drawingml/2006/main">
+                  <a:graphicData uri="http://schemas.microsoft.com/office/word/2010/wordprocessingShape">
+                    <wps:wsp>
+                      <wps:cNvCnPr/>
+                      <wps:spPr>
+                        <a:xfrm flipH="1" flipV="1">
+                          <a:off x="0" y="0"/>
+                          <a:ext cx="1527464" cy="406977"/>
+                        </a:xfrm>
+                        <a:prstGeom prst="straightConnector1">
+                          <a:avLst/>
+                        </a:prstGeom>
+                        <a:ln>
+                          <a:tailEnd type="triangle"/>
+                        </a:ln>
+                      </wps:spPr>
+                      <wps:style>
+                        <a:lnRef idx="2">
+                          <a:schemeClr val="accent1"/>
+                        </a:lnRef>
+                        <a:fillRef idx="0">
+                          <a:schemeClr val="accent1"/>
+                        </a:fillRef>
+                        <a:effectRef idx="1">
+                          <a:schemeClr val="accent1"/>
+                        </a:effectRef>
+                        <a:fontRef idx="minor">
+                          <a:schemeClr val="tx1"/>
+                        </a:fontRef>
+                      </wps:style>
+                      <wps:bodyPr/>
+                    </wps:wsp>
+                  </a:graphicData>
+                </a:graphic>
+                <wp14:sizeRelH relativeFrom="margin">
+                  <wp14:pctWidth>0</wp14:pctWidth>
+                </wp14:sizeRelH>
+                <wp14:sizeRelV relativeFrom="margin">
+                  <wp14:pctHeight>0</wp14:pctHeight>
+                </wp14:sizeRelV>
+              </wp:anchor>
+            </w:drawing>
+          </mc:Choice>
+          <mc:Fallback>
+            <w:pict>
+              <v:shapetype w14:anchorId="3C3FC8BD" id="_x0000_t32" coordsize="21600,21600" o:spt="32" o:oned="t" path="m,l21600,21600e" filled="f">
+                <v:path arrowok="t" fillok="f" o:connecttype="none"/>
+                <o:lock v:ext="edit" shapetype="t"/>
+              </v:shapetype>
+              <v:shape id="Straight Arrow Connector 1" o:spid="_x0000_s1026" type="#_x0000_t32" style="position:absolute;margin-left:205.9pt;margin-top:3.6pt;width:120.25pt;height:32.05pt;flip:x y;z-index:251659264;visibility:visible;mso-wrap-style:square;mso-width-percent:0;mso-height-percent:0;mso-wrap-distance-left:9pt;mso-wrap-distance-top:0;mso-wrap-distance-right:9pt;mso-wrap-distance-bottom:0;mso-position-horizontal:absolute;mso-position-horizontal-relative:text;mso-position-vertical:absolute;mso-position-vertical-relative:text;mso-width-percent:0;mso-height-percent:0;mso-width-relative:margin;mso-height-relative:margin" o:gfxdata="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" strokecolor="#156082 [3204]" strokeweight="1.5pt">
+                <v:stroke endarrow="block" joinstyle="miter"/>
+              </v:shape>
+            </w:pict>
+          </mc:Fallback>
+        </mc:AlternateContent>
+      </w:r>
+      <w:r>
+        <w:rPr>
+          <w:rFonts w:ascii="Cascadia Mono" w:hAnsi="Cascadia Mono" w:cs="Cascadia Mono"/>
+          <w:color w:val="000000"/>
+          <w:kern w:val="0"/>
+          <w:sz w:val="19"/>
+          <w:szCs w:val="19"/>
+          <w:highlight w:val="white"/>
+        </w:rPr>
+        <w:tab/>
+      </w:r>
+      <w:r>
+        <w:rPr>
+          <w:rFonts w:ascii="Cascadia Mono" w:hAnsi="Cascadia Mono" w:cs="Cascadia Mono"/>
+          <w:color w:val="0000FF"/>
+          <w:kern w:val="0"/>
+          <w:sz w:val="19"/>
+          <w:szCs w:val="19"/>
+          <w:highlight w:val="white"/>
+          <w:lang w:val="en-GB"/>
+        </w:rPr>
+        <w:t>if</w:t>
+      </w:r>
+      <w:r>
+        <w:rPr>
+          <w:rFonts w:ascii="Cascadia Mono" w:hAnsi="Cascadia Mono" w:cs="Cascadia Mono"/>
+          <w:color w:val="000000"/>
+          <w:kern w:val="0"/>
+          <w:sz w:val="19"/>
+          <w:szCs w:val="19"/>
+          <w:highlight w:val="white"/>
+          <w:lang w:val="en-GB"/>
+        </w:rPr>
+        <w:t xml:space="preserve"> (it </w:t>
+      </w:r>
+      <w:r>
+        <w:rPr>
+          <w:rFonts w:ascii="Cascadia Mono" w:hAnsi="Cascadia Mono" w:cs="Cascadia Mono"/>
+          <w:color w:val="008080"/>
+          <w:kern w:val="0"/>
+          <w:sz w:val="19"/>
+          <w:szCs w:val="19"/>
+          <w:highlight w:val="white"/>
+          <w:lang w:val="en-GB"/>
+        </w:rPr>
+        <w:t>==</w:t>
+      </w:r>
+      <w:r>
+        <w:rPr>
+          <w:rFonts w:ascii="Cascadia Mono" w:hAnsi="Cascadia Mono" w:cs="Cascadia Mono"/>
+          <w:color w:val="000000"/>
+          <w:kern w:val="0"/>
+          <w:sz w:val="19"/>
+          <w:szCs w:val="19"/>
+          <w:highlight w:val="white"/>
+          <w:lang w:val="en-GB"/>
+        </w:rPr>
+        <w:t xml:space="preserve"> </w:t>
+      </w:r>
+      <w:proofErr w:type="spellStart"/>
+      <w:proofErr w:type="gramStart"/>
+      <w:r>
+        <w:rPr>
+          <w:rFonts w:ascii="Cascadia Mono" w:hAnsi="Cascadia Mono" w:cs="Cascadia Mono"/>
+          <w:color w:val="000000"/>
+          <w:kern w:val="0"/>
+          <w:sz w:val="19"/>
+          <w:szCs w:val="19"/>
+          <w:highlight w:val="white"/>
+          <w:lang w:val="en-GB"/>
+        </w:rPr>
+        <w:t>vect.end</w:t>
+      </w:r>
+      <w:proofErr w:type="spellEnd"/>
+      <w:r>
+        <w:rPr>
+          <w:rFonts w:ascii="Cascadia Mono" w:hAnsi="Cascadia Mono" w:cs="Cascadia Mono"/>
+          <w:color w:val="000000"/>
+          <w:kern w:val="0"/>
+          <w:sz w:val="19"/>
+          <w:szCs w:val="19"/>
+          <w:highlight w:val="white"/>
+          <w:lang w:val="en-GB"/>
+        </w:rPr>
+        <w:t>(</w:t>
+      </w:r>
+      <w:proofErr w:type="gramEnd"/>
+      <w:r>
+        <w:rPr>
+          <w:rFonts w:ascii="Cascadia Mono" w:hAnsi="Cascadia Mono" w:cs="Cascadia Mono"/>
+          <w:color w:val="000000"/>
+          <w:kern w:val="0"/>
+          <w:sz w:val="19"/>
+          <w:szCs w:val="19"/>
+          <w:highlight w:val="white"/>
+          <w:lang w:val="en-GB"/>
+        </w:rPr>
+        <w:t>))</w:t>
+      </w:r>
+    </w:p>
+    <w:p>
+      <w:pPr>
+        <w:autoSpaceDE w:val="0"/>
+        <w:autoSpaceDN w:val="0"/>
+        <w:adjustRightInd w:val="0"/>
+        <w:spacing w:after="0" w:line="240" w:lineRule="auto"/>
+        <w:rPr>
+          <w:rFonts w:ascii="Cascadia Mono" w:hAnsi="Cascadia Mono" w:cs="Cascadia Mono"/>
+          <w:color w:val="000000"/>
+          <w:kern w:val="0"/>
+          <w:sz w:val="19"/>
+          <w:szCs w:val="19"/>
+          <w:highlight w:val="white"/>
+          <w:lang w:val="en-GB"/>
+        </w:rPr>
+      </w:pPr>
+      <w:r>
+        <w:rPr>
+          <w:rFonts w:ascii="Cascadia Mono" w:hAnsi="Cascadia Mono" w:cs="Cascadia Mono"/>
+          <w:color w:val="000000"/>
+          <w:kern w:val="0"/>
+          <w:sz w:val="19"/>
+          <w:szCs w:val="19"/>
+          <w:highlight w:val="white"/>
+          <w:lang w:val="en-GB"/>
+        </w:rPr>
+        <w:tab/>
+      </w:r>
+      <w:r>
+        <w:rPr>
+          <w:rFonts w:ascii="Cascadia Mono" w:hAnsi="Cascadia Mono" w:cs="Cascadia Mono"/>
+          <w:color w:val="000000"/>
+          <w:kern w:val="0"/>
+          <w:sz w:val="19"/>
+          <w:szCs w:val="19"/>
+          <w:highlight w:val="white"/>
+          <w:lang w:val="en-GB"/>
+        </w:rPr>
+        <w:tab/>
+      </w:r>
+      <w:proofErr w:type="spellStart"/>
+      <w:r>
+        <w:rPr>
+          <w:rFonts w:ascii="Cascadia Mono" w:hAnsi="Cascadia Mono" w:cs="Cascadia Mono"/>
+          <w:color w:val="000000"/>
+          <w:kern w:val="0"/>
+          <w:sz w:val="19"/>
+          <w:szCs w:val="19"/>
+          <w:highlight w:val="white"/>
+          <w:lang w:val="en-GB"/>
+        </w:rPr>
+        <w:t>cout</w:t>
+      </w:r>
+      <w:proofErr w:type="spellEnd"/>
+      <w:r>
+        <w:rPr>
+          <w:rFonts w:ascii="Cascadia Mono" w:hAnsi="Cascadia Mono" w:cs="Cascadia Mono"/>
+          <w:color w:val="000000"/>
+          <w:kern w:val="0"/>
+          <w:sz w:val="19"/>
+          <w:szCs w:val="19"/>
+          <w:highlight w:val="white"/>
+          <w:lang w:val="en-GB"/>
+        </w:rPr>
+        <w:t xml:space="preserve"> </w:t>
+      </w:r>
+      <w:r>
+        <w:rPr>
+          <w:rFonts w:ascii="Cascadia Mono" w:hAnsi="Cascadia Mono" w:cs="Cascadia Mono"/>
+          <w:color w:val="008080"/>
+          <w:kern w:val="0"/>
+          <w:sz w:val="19"/>
+          <w:szCs w:val="19"/>
+          <w:highlight w:val="white"/>
+          <w:lang w:val="en-GB"/>
+        </w:rPr>
+        <w:t>&lt;&lt;</w:t>
+      </w:r>
+      <w:r>
+        <w:rPr>
+          <w:rFonts w:ascii="Cascadia Mono" w:hAnsi="Cascadia Mono" w:cs="Cascadia Mono"/>
+          <w:color w:val="000000"/>
+          <w:kern w:val="0"/>
+          <w:sz w:val="19"/>
+          <w:szCs w:val="19"/>
+          <w:highlight w:val="white"/>
+          <w:lang w:val="en-GB"/>
+        </w:rPr>
+        <w:t xml:space="preserve"> </w:t>
+      </w:r>
+      <w:r>
+        <w:rPr>
+          <w:rFonts w:ascii="Cascadia Mono" w:hAnsi="Cascadia Mono" w:cs="Cascadia Mono"/>
+          <w:color w:val="A31515"/>
+          <w:kern w:val="0"/>
+          <w:sz w:val="19"/>
+          <w:szCs w:val="19"/>
+          <w:highlight w:val="white"/>
+          <w:lang w:val="en-GB"/>
+        </w:rPr>
+        <w:t>"non trovato"</w:t>
+      </w:r>
+      <w:r>
+        <w:rPr>
+          <w:rFonts w:ascii="Cascadia Mono" w:hAnsi="Cascadia Mono" w:cs="Cascadia Mono"/>
+          <w:color w:val="000000"/>
+          <w:kern w:val="0"/>
+          <w:sz w:val="19"/>
+          <w:szCs w:val="19"/>
+          <w:highlight w:val="white"/>
+          <w:lang w:val="en-GB"/>
+        </w:rPr>
+        <w:t xml:space="preserve"> </w:t>
+      </w:r>
+      <w:r>
+        <w:rPr>
+          <w:rFonts w:ascii="Cascadia Mono" w:hAnsi="Cascadia Mono" w:cs="Cascadia Mono"/>
+          <w:color w:val="008080"/>
+          <w:kern w:val="0"/>
+          <w:sz w:val="19"/>
+          <w:szCs w:val="19"/>
+          <w:highlight w:val="white"/>
+          <w:lang w:val="en-GB"/>
+        </w:rPr>
+        <w:t>&lt;&lt;</w:t>
+      </w:r>
+      <w:r>
+        <w:rPr>
+          <w:rFonts w:ascii="Cascadia Mono" w:hAnsi="Cascadia Mono" w:cs="Cascadia Mono"/>
+          <w:color w:val="000000"/>
+          <w:kern w:val="0"/>
+          <w:sz w:val="19"/>
+          <w:szCs w:val="19"/>
+          <w:highlight w:val="white"/>
+          <w:lang w:val="en-GB"/>
+        </w:rPr>
+        <w:t xml:space="preserve"> </w:t>
+      </w:r>
+      <w:proofErr w:type="spellStart"/>
+      <w:r>
+        <w:rPr>
+          <w:rFonts w:ascii="Cascadia Mono" w:hAnsi="Cascadia Mono" w:cs="Cascadia Mono"/>
+          <w:color w:val="000000"/>
+          <w:kern w:val="0"/>
+          <w:sz w:val="19"/>
+          <w:szCs w:val="19"/>
+          <w:highlight w:val="white"/>
+          <w:lang w:val="en-GB"/>
+        </w:rPr>
+        <w:t>endl</w:t>
+      </w:r>
+      <w:proofErr w:type="spellEnd"/>
+      <w:r>
+        <w:rPr>
+          <w:rFonts w:ascii="Cascadia Mono" w:hAnsi="Cascadia Mono" w:cs="Cascadia Mono"/>
+          <w:color w:val="000000"/>
+          <w:kern w:val="0"/>
+          <w:sz w:val="19"/>
+          <w:szCs w:val="19"/>
+          <w:highlight w:val="white"/>
+          <w:lang w:val="en-GB"/>
+        </w:rPr>
+        <w:t>;</w:t>
+      </w:r>
+    </w:p>
+    <w:p>
+      <w:pPr>
+        <w:autoSpaceDE w:val="0"/>
+        <w:autoSpaceDN w:val="0"/>
+        <w:adjustRightInd w:val="0"/>
+        <w:spacing w:after="0" w:line="240" w:lineRule="auto"/>
+      </w:pPr>
+      <w:r>
+        <w:rPr>
+          <w:rFonts w:ascii="Cascadia Mono" w:hAnsi="Cascadia Mono" w:cs="Cascadia Mono"/>
+          <w:color w:val="000000"/>
+          <w:kern w:val="0"/>
+          <w:sz w:val="19"/>
+          <w:szCs w:val="19"/>
+          <w:highlight w:val="white"/>
+          <w:lang w:val="en-GB"/>
+        </w:rPr>
+        <w:tab/>
+      </w:r>
+      <w:r>
+        <w:rPr>
+          <w:rFonts w:ascii="Cascadia Mono" w:hAnsi="Cascadia Mono" w:cs="Cascadia Mono"/>
+          <w:color w:val="0000FF"/>
+          <w:kern w:val="0"/>
+          <w:sz w:val="19"/>
+          <w:szCs w:val="19"/>
+          <w:highlight w:val="white"/>
+          <w:lang w:val="en-GB"/>
+        </w:rPr>
+        <w:t>else</w:t>
+      </w:r>
+      <w:r>
+        <w:rPr>
+          <w:rFonts w:ascii="Cascadia Mono" w:hAnsi="Cascadia Mono" w:cs="Cascadia Mono"/>
+          <w:color w:val="000000"/>
+          <w:kern w:val="0"/>
+          <w:sz w:val="19"/>
+          <w:szCs w:val="19"/>
+          <w:highlight w:val="white"/>
+          <w:lang w:val="en-GB"/>
+        </w:rPr>
+        <w:t xml:space="preserve"> </w:t>
+      </w:r>
+      <w:proofErr w:type="spellStart"/>
+      <w:r>
+        <w:rPr>
+          <w:rFonts w:ascii="Cascadia Mono" w:hAnsi="Cascadia Mono" w:cs="Cascadia Mono"/>
+          <w:color w:val="000000"/>
+          <w:kern w:val="0"/>
+          <w:sz w:val="19"/>
+          <w:szCs w:val="19"/>
+          <w:highlight w:val="white"/>
+          <w:lang w:val="en-GB"/>
+        </w:rPr>
+        <w:t>cout</w:t>
+      </w:r>
+      <w:proofErr w:type="spellEnd"/>
+      <w:r>
+        <w:rPr>
+          <w:rFonts w:ascii="Cascadia Mono" w:hAnsi="Cascadia Mono" w:cs="Cascadia Mono"/>
+          <w:color w:val="000000"/>
+          <w:kern w:val="0"/>
+          <w:sz w:val="19"/>
+          <w:szCs w:val="19"/>
+          <w:highlight w:val="white"/>
+          <w:lang w:val="en-GB"/>
+        </w:rPr>
+        <w:t xml:space="preserve"> </w:t>
+      </w:r>
+      <w:r>
+        <w:rPr>
+          <w:rFonts w:ascii="Cascadia Mono" w:hAnsi="Cascadia Mono" w:cs="Cascadia Mono"/>
+          <w:color w:val="008080"/>
+          <w:kern w:val="0"/>
+          <w:sz w:val="19"/>
+          <w:szCs w:val="19"/>
+          <w:highlight w:val="white"/>
+          <w:lang w:val="en-GB"/>
+        </w:rPr>
+        <w:t>&lt;&lt;</w:t>
+      </w:r>
+      <w:r>
+        <w:rPr>
+          <w:rFonts w:ascii="Cascadia Mono" w:hAnsi="Cascadia Mono" w:cs="Cascadia Mono"/>
+          <w:color w:val="000000"/>
+          <w:kern w:val="0"/>
+          <w:sz w:val="19"/>
+          <w:szCs w:val="19"/>
+          <w:highlight w:val="white"/>
+          <w:lang w:val="en-GB"/>
+        </w:rPr>
+        <w:t xml:space="preserve"> </w:t>
+      </w:r>
+      <w:r>
+        <w:rPr>
+          <w:rFonts w:ascii="Cascadia Mono" w:hAnsi="Cascadia Mono" w:cs="Cascadia Mono"/>
+          <w:color w:val="A31515"/>
+          <w:kern w:val="0"/>
+          <w:sz w:val="19"/>
+          <w:szCs w:val="19"/>
+          <w:highlight w:val="white"/>
+          <w:lang w:val="en-GB"/>
+        </w:rPr>
+        <w:t>"trovato"</w:t>
+      </w:r>
+      <w:r>
+        <w:rPr>
+          <w:rFonts w:ascii="Cascadia Mono" w:hAnsi="Cascadia Mono" w:cs="Cascadia Mono"/>
+          <w:color w:val="000000"/>
+          <w:kern w:val="0"/>
+          <w:sz w:val="19"/>
+          <w:szCs w:val="19"/>
+          <w:highlight w:val="white"/>
+          <w:lang w:val="en-GB"/>
+        </w:rPr>
+        <w:t xml:space="preserve"> </w:t>
+      </w:r>
+      <w:r>
+        <w:rPr>
+          <w:rFonts w:ascii="Cascadia Mono" w:hAnsi="Cascadia Mono" w:cs="Cascadia Mono"/>
+          <w:color w:val="008080"/>
+          <w:kern w:val="0"/>
+          <w:sz w:val="19"/>
+          <w:szCs w:val="19"/>
+          <w:highlight w:val="white"/>
+          <w:lang w:val="en-GB"/>
+        </w:rPr>
+        <w:t>&lt;&lt;</w:t>
+      </w:r>
+      <w:r>
+        <w:rPr>
+          <w:rFonts w:ascii="Cascadia Mono" w:hAnsi="Cascadia Mono" w:cs="Cascadia Mono"/>
+          <w:color w:val="000000"/>
+          <w:kern w:val="0"/>
+          <w:sz w:val="19"/>
+          <w:szCs w:val="19"/>
+          <w:highlight w:val="white"/>
+          <w:lang w:val="en-GB"/>
+        </w:rPr>
+        <w:t xml:space="preserve"> </w:t>
+      </w:r>
+      <w:proofErr w:type="spellStart"/>
+      <w:r>
+        <w:rPr>
+          <w:rFonts w:ascii="Cascadia Mono" w:hAnsi="Cascadia Mono" w:cs="Cascadia Mono"/>
+          <w:color w:val="000000"/>
+          <w:kern w:val="0"/>
+          <w:sz w:val="19"/>
+          <w:szCs w:val="19"/>
+          <w:highlight w:val="white"/>
+          <w:lang w:val="en-GB"/>
+        </w:rPr>
+        <w:t>endl</w:t>
+      </w:r>
+      <w:proofErr w:type="spellEnd"/>
+      <w:r>
+        <w:rPr>
+          <w:rFonts w:ascii="Cascadia Mono" w:hAnsi="Cascadia Mono" w:cs="Cascadia Mono"/>
+          <w:color w:val="000000"/>
+          <w:kern w:val="0"/>
+          <w:sz w:val="19"/>
+          <w:szCs w:val="19"/>
+          <w:highlight w:val="white"/>
+          <w:lang w:val="en-GB"/>
+        </w:rPr>
+        <w:t>;</w:t>
+      </w:r>
+    </w:p>
+    <w:p>
+      <w:r>
+        <w:rPr>
+          <w:noProof/>
+        </w:rPr>
+        <mc:AlternateContent>
+          <mc:Choice Requires="wps">
+            <w:drawing>
+              <wp:anchor distT="0" distB="0" distL="114300" distR="114300" simplePos="0" relativeHeight="251660288" behindDoc="1" locked="0" layoutInCell="1" allowOverlap="1" wp14:anchorId="2416C04F" wp14:editId="026023CA">
+                <wp:simplePos x="0" y="0"/>
+                <wp:positionH relativeFrom="page">
+                  <wp:posOffset>4066078</wp:posOffset>
+                </wp:positionH>
+                <wp:positionV relativeFrom="paragraph">
+                  <wp:posOffset>122209</wp:posOffset>
+                </wp:positionV>
+                <wp:extent cx="3338945" cy="1204999"/>
+                <wp:effectExtent l="0" t="0" r="13970" b="14605"/>
+                <wp:wrapNone/>
+                <wp:docPr id="217" name="Text Box 2"/>
+                <wp:cNvGraphicFramePr>
+                  <a:graphicFrameLocks xmlns:a="http://schemas.openxmlformats.org/drawingml/2006/main"/>
+                </wp:cNvGraphicFramePr>
+                <a:graphic xmlns:a="http://schemas.openxmlformats.org/drawingml/2006/main">
+                  <a:graphicData uri="http://schemas.microsoft.com/office/word/2010/wordprocessingShape">
+                    <wps:wsp>
+                      <wps:cNvSpPr txBox="1">
+                        <a:spLocks noChangeArrowheads="1"/>
+                      </wps:cNvSpPr>
+                      <wps:spPr bwMode="auto">
+                        <a:xfrm rot="10800000" flipV="1">
+                          <a:off x="0" y="0"/>
+                          <a:ext cx="3338945" cy="1204999"/>
+                        </a:xfrm>
+                        <a:prstGeom prst="rect">
+                          <a:avLst/>
+                        </a:prstGeom>
+                        <a:noFill/>
+                        <a:ln w="9525">
+                          <a:solidFill>
+                            <a:schemeClr val="bg1"/>
+                          </a:solidFill>
+                          <a:miter lim="800000"/>
+                          <a:headEnd/>
+                          <a:tailEnd/>
+                        </a:ln>
+                      </wps:spPr>
+                      <wps:txbx>
+                        <w:txbxContent>
+                          <w:p>
+                            <w:pPr>
+                              <w:rPr>
+                                <w:sz w:val="22"/>
+                                <w:szCs w:val="22"/>
+                              </w:rPr>
+                            </w:pPr>
+                            <w:r>
+                              <w:rPr>
+                                <w:sz w:val="22"/>
+                                <w:szCs w:val="22"/>
+                              </w:rPr>
+                              <w:t>È un metodo standard della libreria STL e applicabile solo alle strutture sequenziali (vector e list).</w:t>
+                            </w:r>
+                          </w:p>
+                          <w:p>
+                            <w:pPr>
+                              <w:rPr>
+                                <w:sz w:val="22"/>
+                                <w:szCs w:val="22"/>
+                              </w:rPr>
+                            </w:pPr>
+                            <w:r>
+                              <w:rPr>
+                                <w:sz w:val="22"/>
+                                <w:szCs w:val="22"/>
+                              </w:rPr>
+                              <w:t>Map e set hanno inernamente il proprio e non si può proprio usare questo perché il meto</w:t>
+                            </w:r>
+                            <w:r>
+                              <w:rPr>
+                                <w:sz w:val="22"/>
+                                <w:szCs w:val="22"/>
+                              </w:rPr>
+                              <w:t>d</w:t>
+                            </w:r>
+                            <w:r>
+                              <w:rPr>
+                                <w:sz w:val="22"/>
+                                <w:szCs w:val="22"/>
+                              </w:rPr>
+                              <w:t>o li tratterebbe come vector portando a un errore</w:t>
+                            </w:r>
+                            <w:r>
+                              <w:rPr>
+                                <w:sz w:val="22"/>
+                                <w:szCs w:val="22"/>
+                              </w:rPr>
+                              <w:t>.</w:t>
+                            </w:r>
+                          </w:p>
+                        </w:txbxContent>
+                      </wps:txbx>
+                      <wps:bodyPr rot="0" vert="horz" wrap="square" lIns="91440" tIns="45720" rIns="91440" bIns="45720" anchor="t" anchorCtr="0">
+                        <a:noAutofit/>
+                      </wps:bodyPr>
+                    </wps:wsp>
+                  </a:graphicData>
+                </a:graphic>
+                <wp14:sizeRelH relativeFrom="margin">
+                  <wp14:pctWidth>0</wp14:pctWidth>
+                </wp14:sizeRelH>
+                <wp14:sizeRelV relativeFrom="margin">
+                  <wp14:pctHeight>0</wp14:pctHeight>
+                </wp14:sizeRelV>
+              </wp:anchor>
+            </w:drawing>
+          </mc:Choice>
+          <mc:Fallback>
+            <w:pict>
+              <v:shapetype w14:anchorId="2416C04F" id="_x0000_t202" coordsize="21600,21600" o:spt="202" path="m,l,21600r21600,l21600,xe">
+                <v:stroke joinstyle="miter"/>
+                <v:path gradientshapeok="t" o:connecttype="rect"/>
+              </v:shapetype>
+              <v:shape id="Text Box 2" o:spid="_x0000_s1026" type="#_x0000_t202" style="position:absolute;margin-left:320.15pt;margin-top:9.6pt;width:262.9pt;height:94.9pt;rotation:180;flip:y;z-index:-251656192;visibility:visible;mso-wrap-style:square;mso-width-percent:0;mso-height-percent:0;mso-wrap-distance-left:9pt;mso-wrap-distance-top:0;mso-wrap-distance-right:9pt;mso-wrap-distance-bottom:0;mso-position-horizontal:absolute;mso-position-horizontal-relative:page;mso-position-vertical:absolute;mso-position-vertical-relative:text;mso-width-percent:0;mso-height-percent:0;mso-width-relative:margin;mso-height-relative:margin;v-text-anchor:top" o:gfxdata="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" filled="f" strokecolor="white [3212]">
+                <v:textbox>
+                  <w:txbxContent>
+                    <w:p>
+                      <w:pPr>
+                        <w:rPr>
+                          <w:sz w:val="22"/>
+                          <w:szCs w:val="22"/>
+                        </w:rPr>
+                      </w:pPr>
+                      <w:r>
+                        <w:rPr>
+                          <w:sz w:val="22"/>
+                          <w:szCs w:val="22"/>
+                        </w:rPr>
+                        <w:t>È un metodo standard della libreria STL e applicabile solo alle strutture sequenziali (vector e list).</w:t>
+                      </w:r>
+                    </w:p>
+                    <w:p>
+                      <w:pPr>
+                        <w:rPr>
+                          <w:sz w:val="22"/>
+                          <w:szCs w:val="22"/>
+                        </w:rPr>
+                      </w:pPr>
+                      <w:r>
+                        <w:rPr>
+                          <w:sz w:val="22"/>
+                          <w:szCs w:val="22"/>
+                        </w:rPr>
+                        <w:t>Map e set hanno inernamente il proprio e non si può proprio usare questo perché il meto</w:t>
+                      </w:r>
+                      <w:r>
+                        <w:rPr>
+                          <w:sz w:val="22"/>
+                          <w:szCs w:val="22"/>
+                        </w:rPr>
+                        <w:t>d</w:t>
+                      </w:r>
+                      <w:r>
+                        <w:rPr>
+                          <w:sz w:val="22"/>
+                          <w:szCs w:val="22"/>
+                        </w:rPr>
+                        <w:t>o li tratterebbe come vector portando a un errore</w:t>
+                      </w:r>
+                      <w:r>
+                        <w:rPr>
+                          <w:sz w:val="22"/>
+                          <w:szCs w:val="22"/>
+                        </w:rPr>
+                        <w:t>.</w:t>
+                      </w:r>
+                    </w:p>
+                  </w:txbxContent>
+                </v:textbox>
+                <w10:wrap anchorx="page"/>
+              </v:shape>
+            </w:pict>
+          </mc:Fallback>
+        </mc:AlternateContent>
+      </w:r>
+    </w:p>
+    <w:p>
+      <w:pPr>
+        <w:tabs>
+          <w:tab w:val="left" w:pos="7931"/>
+        </w:tabs>
+      </w:pPr>
+      <w:r>
+        <w:tab/>
+      </w:r>
+    </w:p>
+    <w:p>
+      <w:r>
+        <w:lastRenderedPageBreak/>
+        <w:t xml:space="preserve">acesso </w:t>
+      </w:r>
+      <w:r>
+        <w:rPr>
+          <w:u w:val="single"/>
+        </w:rPr>
+        <w:t>Casuale</w:t>
+      </w:r>
+      <w:r>
+        <w:t xml:space="preserve"> (vector, deque): spostamenti arbitrari, si può utilizzare l’aritmetica e il confronto di puntatori.</w:t>
+      </w:r>
+      <w:r>
+        <w:t xml:space="preserve"> </w:t>
+      </w:r>
+    </w:p>
+    <w:p/>
+    <w:p>
+      <w:pPr>
+        <w:rPr>
+          <w:b/>
+          <w:bCs/>
+          <w:sz w:val="28"/>
+          <w:szCs w:val="28"/>
+        </w:rPr>
+      </w:pPr>
+      <w:r>
+        <w:rPr>
+          <w:b/>
+          <w:bCs/>
+          <w:sz w:val="28"/>
+          <w:szCs w:val="28"/>
+        </w:rPr>
         <w:t>Funzioni dei soli container sequenziali e associativi:</w:t>
       </w:r>
     </w:p>
@@ -389,7 +2487,35 @@
         <w:rPr>
           <w:lang w:val="en-GB"/>
         </w:rPr>
-        <w:t>iterator erase (iterator first, iterator last); elimina da “first” incluso a “last”</w:t>
+        <w:t xml:space="preserve">iterator erase (iterator first, iterator last); </w:t>
+      </w:r>
+      <w:proofErr w:type="spellStart"/>
+      <w:r>
+        <w:rPr>
+          <w:lang w:val="en-GB"/>
+        </w:rPr>
+        <w:t>elimina</w:t>
+      </w:r>
+      <w:proofErr w:type="spellEnd"/>
+      <w:r>
+        <w:rPr>
+          <w:lang w:val="en-GB"/>
+        </w:rPr>
+        <w:t xml:space="preserve"> da “first” </w:t>
+      </w:r>
+      <w:proofErr w:type="spellStart"/>
+      <w:r>
+        <w:rPr>
+          <w:lang w:val="en-GB"/>
+        </w:rPr>
+        <w:t>incluso</w:t>
+      </w:r>
+      <w:proofErr w:type="spellEnd"/>
+      <w:r>
+        <w:rPr>
+          <w:lang w:val="en-GB"/>
+        </w:rPr>
+        <w:t xml:space="preserve"> a “last”</w:t>
       </w:r>
       <w:r>
         <w:rPr>
@@ -397,11 +2523,20 @@
         </w:rPr>
         <w:t xml:space="preserve"> </w:t>
       </w:r>
-      <w:r>
-        <w:rPr>
-          <w:lang w:val="en-GB"/>
-        </w:rPr>
-        <w:t xml:space="preserve">escluso </w:t>
+      <w:proofErr w:type="spellStart"/>
+      <w:proofErr w:type="gramStart"/>
+      <w:r>
+        <w:rPr>
+          <w:lang w:val="en-GB"/>
+        </w:rPr>
+        <w:t>escluso</w:t>
+      </w:r>
+      <w:proofErr w:type="spellEnd"/>
+      <w:r>
+        <w:rPr>
+          <w:lang w:val="en-GB"/>
+        </w:rPr>
+        <w:t xml:space="preserve"> </w:t>
       </w:r>
       <w:r>
         <w:rPr>
@@ -409,6 +2544,7 @@
         </w:rPr>
         <w:t>.</w:t>
       </w:r>
+      <w:proofErr w:type="gramEnd"/>
     </w:p>
     <w:p>
       <w:r>
@@ -680,7 +2816,19 @@
           <w:rPr>
             <w:rStyle w:val="Hyperlink"/>
           </w:rPr>
-          <w:t>C:\Users\ricca\Desktop\Uni\cpp\</w:t>
+          <w:t>C</w:t>
+        </w:r>
+        <w:r>
+          <w:rPr>
+            <w:rStyle w:val="Hyperlink"/>
+          </w:rPr>
+          <w:t>:</w:t>
+        </w:r>
+        <w:r>
+          <w:rPr>
+            <w:rStyle w:val="Hyperlink"/>
+          </w:rPr>
+          <w:t>\Users\ricca\Desktop\Uni\cpp\</w:t>
         </w:r>
       </w:hyperlink>
     </w:p>
@@ -1070,7 +3218,49 @@
         <w:rPr>
           <w:lang w:val="en-GB"/>
         </w:rPr>
-        <w:t>map&lt;int, Item&gt; myMap (chiave int, valore Item)</w:t>
+        <w:t xml:space="preserve">map&lt;int, Item&gt; </w:t>
+      </w:r>
+      <w:proofErr w:type="spellStart"/>
+      <w:r>
+        <w:rPr>
+          <w:lang w:val="en-GB"/>
+        </w:rPr>
+        <w:t>myMap</w:t>
+      </w:r>
+      <w:proofErr w:type="spellEnd"/>
+      <w:r>
+        <w:rPr>
+          <w:lang w:val="en-GB"/>
+        </w:rPr>
+        <w:t xml:space="preserve"> (</w:t>
+      </w:r>
+      <w:proofErr w:type="spellStart"/>
+      <w:r>
+        <w:rPr>
+          <w:lang w:val="en-GB"/>
+        </w:rPr>
+        <w:t>chiave</w:t>
+      </w:r>
+      <w:proofErr w:type="spellEnd"/>
+      <w:r>
+        <w:rPr>
+          <w:lang w:val="en-GB"/>
+        </w:rPr>
+        <w:t xml:space="preserve"> int, </w:t>
+      </w:r>
+      <w:proofErr w:type="spellStart"/>
+      <w:r>
+        <w:rPr>
+          <w:lang w:val="en-GB"/>
+        </w:rPr>
+        <w:t>valore</w:t>
+      </w:r>
+      <w:proofErr w:type="spellEnd"/>
+      <w:r>
+        <w:rPr>
+          <w:lang w:val="en-GB"/>
+        </w:rPr>
+        <w:t xml:space="preserve"> Item)</w:t>
       </w:r>
     </w:p>
     <w:p>
@@ -1108,65 +3298,119 @@
           <w:lang w:val="en-GB"/>
         </w:rPr>
       </w:pPr>
+      <w:proofErr w:type="spellStart"/>
       <w:r>
         <w:rPr>
           <w:i/>
           <w:iCs/>
           <w:lang w:val="en-GB"/>
         </w:rPr>
-        <w:t>myMap.insert(pippo);</w:t>
-      </w:r>
-    </w:p>
-    <w:p>
-      <w:pPr>
-        <w:tabs>
-          <w:tab w:val="left" w:pos="2172"/>
-        </w:tabs>
-        <w:rPr>
-          <w:lang w:val="en-GB"/>
-        </w:rPr>
-      </w:pPr>
-      <w:r>
-        <w:rPr>
-          <w:lang w:val="en-GB"/>
-        </w:rPr>
-        <w:t>oppure:</w:t>
-      </w:r>
-    </w:p>
-    <w:p>
-      <w:pPr>
-        <w:tabs>
-          <w:tab w:val="left" w:pos="2172"/>
-        </w:tabs>
+        <w:t>myMap.insert</w:t>
+      </w:r>
+      <w:proofErr w:type="spellEnd"/>
+      <w:r>
         <w:rPr>
           <w:i/>
           <w:iCs/>
           <w:lang w:val="en-GB"/>
         </w:rPr>
-      </w:pPr>
+        <w:t>(</w:t>
+      </w:r>
+      <w:proofErr w:type="spellStart"/>
       <w:r>
         <w:rPr>
           <w:i/>
           <w:iCs/>
           <w:lang w:val="en-GB"/>
         </w:rPr>
-        <w:t>typedef pair&lt;int, double&gt; MyPair;</w:t>
-      </w:r>
-    </w:p>
-    <w:p>
-      <w:pPr>
-        <w:tabs>
-          <w:tab w:val="left" w:pos="2172"/>
-        </w:tabs>
+        <w:t>pippo</w:t>
+      </w:r>
+      <w:proofErr w:type="spellEnd"/>
+      <w:r>
         <w:rPr>
           <w:i/>
           <w:iCs/>
-        </w:rPr>
-      </w:pPr>
-      <w:r>
+          <w:lang w:val="en-GB"/>
+        </w:rPr>
+        <w:t>);</w:t>
+      </w:r>
+    </w:p>
+    <w:p>
+      <w:pPr>
+        <w:tabs>
+          <w:tab w:val="left" w:pos="2172"/>
+        </w:tabs>
+        <w:rPr>
+          <w:lang w:val="en-GB"/>
+        </w:rPr>
+      </w:pPr>
+      <w:proofErr w:type="spellStart"/>
+      <w:r>
+        <w:rPr>
+          <w:lang w:val="en-GB"/>
+        </w:rPr>
+        <w:t>oppure</w:t>
+      </w:r>
+      <w:proofErr w:type="spellEnd"/>
+      <w:r>
+        <w:rPr>
+          <w:lang w:val="en-GB"/>
+        </w:rPr>
+        <w:t>:</w:t>
+      </w:r>
+    </w:p>
+    <w:p>
+      <w:pPr>
+        <w:tabs>
+          <w:tab w:val="left" w:pos="2172"/>
+        </w:tabs>
         <w:rPr>
           <w:i/>
           <w:iCs/>
+          <w:lang w:val="en-GB"/>
+        </w:rPr>
+      </w:pPr>
+      <w:r>
+        <w:rPr>
+          <w:i/>
+          <w:iCs/>
+          <w:lang w:val="en-GB"/>
+        </w:rPr>
+        <w:t xml:space="preserve">typedef pair&lt;int, double&gt; </w:t>
+      </w:r>
+      <w:proofErr w:type="spellStart"/>
+      <w:r>
+        <w:rPr>
+          <w:i/>
+          <w:iCs/>
+          <w:lang w:val="en-GB"/>
+        </w:rPr>
+        <w:t>MyPair</w:t>
+      </w:r>
+      <w:proofErr w:type="spellEnd"/>
+      <w:r>
+        <w:rPr>
+          <w:i/>
+          <w:iCs/>
+          <w:lang w:val="en-GB"/>
+        </w:rPr>
+        <w:t>;</w:t>
+      </w:r>
+    </w:p>
+    <w:p>
+      <w:pPr>
+        <w:tabs>
+          <w:tab w:val="left" w:pos="2172"/>
+        </w:tabs>
+        <w:rPr>
+          <w:i/>
+          <w:iCs/>
+        </w:rPr>
+      </w:pPr>
+      <w:r>
+        <w:rPr>
+          <w:i/>
+          <w:iCs/>
         </w:rPr>
         <w:t>myMap.isert(MyPair(1,9.8);</w:t>
       </w:r>
@@ -1216,6 +3460,397 @@
       </w:pPr>
       <w:r>
         <w:t>myMap[“abc”] = 4.4; assegna all’oggetto della mappa con chiave string, 4.4</w:t>
+      </w:r>
+    </w:p>
+    <w:p>
+      <w:pPr>
+        <w:tabs>
+          <w:tab w:val="left" w:pos="2172"/>
+        </w:tabs>
+      </w:pPr>
+    </w:p>
+    <w:p>
+      <w:pPr>
+        <w:tabs>
+          <w:tab w:val="left" w:pos="2172"/>
+        </w:tabs>
+      </w:pPr>
+    </w:p>
+    <w:p>
+      <w:pPr>
+        <w:autoSpaceDE w:val="0"/>
+        <w:autoSpaceDN w:val="0"/>
+        <w:adjustRightInd w:val="0"/>
+        <w:spacing w:after="0" w:line="240" w:lineRule="auto"/>
+        <w:rPr>
+          <w:rFonts w:ascii="Cascadia Mono" w:hAnsi="Cascadia Mono" w:cs="Cascadia Mono"/>
+          <w:color w:val="000000"/>
+          <w:kern w:val="0"/>
+          <w:sz w:val="19"/>
+          <w:szCs w:val="19"/>
+          <w:highlight w:val="white"/>
+        </w:rPr>
+      </w:pPr>
+      <w:r>
+        <w:rPr>
+          <w:highlight w:val="yellow"/>
+        </w:rPr>
+        <w:t>il ritorno di find() è sempre l’iteratore all’oggetto trovato, se non è andato a buon fine, allora sarà un iteratore fantasma all’ultima posizione della struttura:</w:t>
+      </w:r>
+      <w:r>
+        <w:br/>
+      </w:r>
+      <w:r>
+        <w:rPr>
+          <w:rFonts w:ascii="Cascadia Mono" w:hAnsi="Cascadia Mono" w:cs="Cascadia Mono"/>
+          <w:color w:val="2B91AF"/>
+          <w:kern w:val="0"/>
+          <w:sz w:val="19"/>
+          <w:szCs w:val="19"/>
+          <w:highlight w:val="white"/>
+        </w:rPr>
+        <w:t>map</w:t>
+      </w:r>
+      <w:r>
+        <w:rPr>
+          <w:rFonts w:ascii="Cascadia Mono" w:hAnsi="Cascadia Mono" w:cs="Cascadia Mono"/>
+          <w:color w:val="000000"/>
+          <w:kern w:val="0"/>
+          <w:sz w:val="19"/>
+          <w:szCs w:val="19"/>
+          <w:highlight w:val="white"/>
+        </w:rPr>
+        <w:t>&lt;</w:t>
+      </w:r>
+      <w:r>
+        <w:rPr>
+          <w:rFonts w:ascii="Cascadia Mono" w:hAnsi="Cascadia Mono" w:cs="Cascadia Mono"/>
+          <w:color w:val="2B91AF"/>
+          <w:kern w:val="0"/>
+          <w:sz w:val="19"/>
+          <w:szCs w:val="19"/>
+          <w:highlight w:val="white"/>
+        </w:rPr>
+        <w:t>string</w:t>
+      </w:r>
+      <w:r>
+        <w:rPr>
+          <w:rFonts w:ascii="Cascadia Mono" w:hAnsi="Cascadia Mono" w:cs="Cascadia Mono"/>
+          <w:color w:val="000000"/>
+          <w:kern w:val="0"/>
+          <w:sz w:val="19"/>
+          <w:szCs w:val="19"/>
+          <w:highlight w:val="white"/>
+        </w:rPr>
+        <w:t xml:space="preserve">, </w:t>
+      </w:r>
+      <w:r>
+        <w:rPr>
+          <w:rFonts w:ascii="Cascadia Mono" w:hAnsi="Cascadia Mono" w:cs="Cascadia Mono"/>
+          <w:color w:val="2B91AF"/>
+          <w:kern w:val="0"/>
+          <w:sz w:val="19"/>
+          <w:szCs w:val="19"/>
+          <w:highlight w:val="white"/>
+        </w:rPr>
+        <w:t>set</w:t>
+      </w:r>
+      <w:r>
+        <w:rPr>
+          <w:rFonts w:ascii="Cascadia Mono" w:hAnsi="Cascadia Mono" w:cs="Cascadia Mono"/>
+          <w:color w:val="000000"/>
+          <w:kern w:val="0"/>
+          <w:sz w:val="19"/>
+          <w:szCs w:val="19"/>
+          <w:highlight w:val="white"/>
+        </w:rPr>
+        <w:t>&lt;</w:t>
+      </w:r>
+      <w:r>
+        <w:rPr>
+          <w:rFonts w:ascii="Cascadia Mono" w:hAnsi="Cascadia Mono" w:cs="Cascadia Mono"/>
+          <w:color w:val="0000FF"/>
+          <w:kern w:val="0"/>
+          <w:sz w:val="19"/>
+          <w:szCs w:val="19"/>
+          <w:highlight w:val="white"/>
+        </w:rPr>
+        <w:t>int</w:t>
+      </w:r>
+      <w:r>
+        <w:rPr>
+          <w:rFonts w:ascii="Cascadia Mono" w:hAnsi="Cascadia Mono" w:cs="Cascadia Mono"/>
+          <w:color w:val="000000"/>
+          <w:kern w:val="0"/>
+          <w:sz w:val="19"/>
+          <w:szCs w:val="19"/>
+          <w:highlight w:val="white"/>
+        </w:rPr>
+        <w:t>&gt; &gt;::</w:t>
+      </w:r>
+      <w:r>
+        <w:rPr>
+          <w:rFonts w:ascii="Cascadia Mono" w:hAnsi="Cascadia Mono" w:cs="Cascadia Mono"/>
+          <w:color w:val="2B91AF"/>
+          <w:kern w:val="0"/>
+          <w:sz w:val="19"/>
+          <w:szCs w:val="19"/>
+          <w:highlight w:val="white"/>
+        </w:rPr>
+        <w:t>iterator</w:t>
+      </w:r>
+      <w:r>
+        <w:rPr>
+          <w:rFonts w:ascii="Cascadia Mono" w:hAnsi="Cascadia Mono" w:cs="Cascadia Mono"/>
+          <w:color w:val="000000"/>
+          <w:kern w:val="0"/>
+          <w:sz w:val="19"/>
+          <w:szCs w:val="19"/>
+          <w:highlight w:val="white"/>
+        </w:rPr>
+        <w:t xml:space="preserve"> it = </w:t>
+      </w:r>
+      <w:r>
+        <w:rPr>
+          <w:rFonts w:ascii="Cascadia Mono" w:hAnsi="Cascadia Mono" w:cs="Cascadia Mono"/>
+          <w:color w:val="808080"/>
+          <w:kern w:val="0"/>
+          <w:sz w:val="19"/>
+          <w:szCs w:val="19"/>
+          <w:highlight w:val="white"/>
+        </w:rPr>
+        <w:t>lotto</w:t>
+      </w:r>
+      <w:r>
+        <w:rPr>
+          <w:rFonts w:ascii="Cascadia Mono" w:hAnsi="Cascadia Mono" w:cs="Cascadia Mono"/>
+          <w:color w:val="000000"/>
+          <w:kern w:val="0"/>
+          <w:sz w:val="19"/>
+          <w:szCs w:val="19"/>
+          <w:highlight w:val="white"/>
+        </w:rPr>
+        <w:t>.find(</w:t>
+      </w:r>
+      <w:r>
+        <w:rPr>
+          <w:rFonts w:ascii="Cascadia Mono" w:hAnsi="Cascadia Mono" w:cs="Cascadia Mono"/>
+          <w:color w:val="808080"/>
+          <w:kern w:val="0"/>
+          <w:sz w:val="19"/>
+          <w:szCs w:val="19"/>
+          <w:highlight w:val="white"/>
+        </w:rPr>
+        <w:t>ruota</w:t>
+      </w:r>
+      <w:r>
+        <w:rPr>
+          <w:rFonts w:ascii="Cascadia Mono" w:hAnsi="Cascadia Mono" w:cs="Cascadia Mono"/>
+          <w:color w:val="000000"/>
+          <w:kern w:val="0"/>
+          <w:sz w:val="19"/>
+          <w:szCs w:val="19"/>
+          <w:highlight w:val="white"/>
+        </w:rPr>
+        <w:t xml:space="preserve">); </w:t>
+      </w:r>
+      <w:r>
+        <w:rPr>
+          <w:rFonts w:ascii="Cascadia Mono" w:hAnsi="Cascadia Mono" w:cs="Cascadia Mono"/>
+          <w:color w:val="008000"/>
+          <w:kern w:val="0"/>
+          <w:sz w:val="19"/>
+          <w:szCs w:val="19"/>
+          <w:highlight w:val="white"/>
+        </w:rPr>
+        <w:t>//it è un iteratore alla map ricercata, se dereferenziato il tipo è pair, pertanto c'è .first e .second che ritornano stringa o set&lt;int&gt; (con in numeri della ruota).</w:t>
+      </w:r>
+    </w:p>
+    <w:p>
+      <w:pPr>
+        <w:tabs>
+          <w:tab w:val="left" w:pos="2172"/>
+        </w:tabs>
+        <w:rPr>
+          <w:rFonts w:ascii="Cascadia Mono" w:hAnsi="Cascadia Mono" w:cs="Cascadia Mono"/>
+          <w:color w:val="000000"/>
+          <w:kern w:val="0"/>
+          <w:sz w:val="19"/>
+          <w:szCs w:val="19"/>
+          <w:lang w:val="en-GB"/>
+        </w:rPr>
+      </w:pPr>
+      <w:r>
+        <w:rPr>
+          <w:rFonts w:ascii="Cascadia Mono" w:hAnsi="Cascadia Mono" w:cs="Cascadia Mono"/>
+          <w:color w:val="0000FF"/>
+          <w:kern w:val="0"/>
+          <w:sz w:val="19"/>
+          <w:szCs w:val="19"/>
+          <w:highlight w:val="white"/>
+          <w:lang w:val="en-GB"/>
+        </w:rPr>
+        <w:t>if</w:t>
+      </w:r>
+      <w:r>
+        <w:rPr>
+          <w:rFonts w:ascii="Cascadia Mono" w:hAnsi="Cascadia Mono" w:cs="Cascadia Mono"/>
+          <w:color w:val="000000"/>
+          <w:kern w:val="0"/>
+          <w:sz w:val="19"/>
+          <w:szCs w:val="19"/>
+          <w:highlight w:val="white"/>
+          <w:lang w:val="en-GB"/>
+        </w:rPr>
+        <w:t xml:space="preserve"> (it </w:t>
+      </w:r>
+      <w:r>
+        <w:rPr>
+          <w:rFonts w:ascii="Cascadia Mono" w:hAnsi="Cascadia Mono" w:cs="Cascadia Mono"/>
+          <w:color w:val="008080"/>
+          <w:kern w:val="0"/>
+          <w:sz w:val="19"/>
+          <w:szCs w:val="19"/>
+          <w:highlight w:val="white"/>
+          <w:lang w:val="en-GB"/>
+        </w:rPr>
+        <w:t>==</w:t>
+      </w:r>
+      <w:r>
+        <w:rPr>
+          <w:rFonts w:ascii="Cascadia Mono" w:hAnsi="Cascadia Mono" w:cs="Cascadia Mono"/>
+          <w:color w:val="000000"/>
+          <w:kern w:val="0"/>
+          <w:sz w:val="19"/>
+          <w:szCs w:val="19"/>
+          <w:highlight w:val="white"/>
+          <w:lang w:val="en-GB"/>
+        </w:rPr>
+        <w:t xml:space="preserve"> </w:t>
+      </w:r>
+      <w:proofErr w:type="spellStart"/>
+      <w:proofErr w:type="gramStart"/>
+      <w:r>
+        <w:rPr>
+          <w:rFonts w:ascii="Cascadia Mono" w:hAnsi="Cascadia Mono" w:cs="Cascadia Mono"/>
+          <w:color w:val="808080"/>
+          <w:kern w:val="0"/>
+          <w:sz w:val="19"/>
+          <w:szCs w:val="19"/>
+          <w:highlight w:val="white"/>
+          <w:lang w:val="en-GB"/>
+        </w:rPr>
+        <w:t>lotto</w:t>
+      </w:r>
+      <w:r>
+        <w:rPr>
+          <w:rFonts w:ascii="Cascadia Mono" w:hAnsi="Cascadia Mono" w:cs="Cascadia Mono"/>
+          <w:color w:val="000000"/>
+          <w:kern w:val="0"/>
+          <w:sz w:val="19"/>
+          <w:szCs w:val="19"/>
+          <w:highlight w:val="white"/>
+          <w:lang w:val="en-GB"/>
+        </w:rPr>
+        <w:t>.end</w:t>
+      </w:r>
+      <w:proofErr w:type="spellEnd"/>
+      <w:r>
+        <w:rPr>
+          <w:rFonts w:ascii="Cascadia Mono" w:hAnsi="Cascadia Mono" w:cs="Cascadia Mono"/>
+          <w:color w:val="000000"/>
+          <w:kern w:val="0"/>
+          <w:sz w:val="19"/>
+          <w:szCs w:val="19"/>
+          <w:highlight w:val="white"/>
+          <w:lang w:val="en-GB"/>
+        </w:rPr>
+        <w:t>(</w:t>
+      </w:r>
+      <w:proofErr w:type="gramEnd"/>
+      <w:r>
+        <w:rPr>
+          <w:rFonts w:ascii="Cascadia Mono" w:hAnsi="Cascadia Mono" w:cs="Cascadia Mono"/>
+          <w:color w:val="000000"/>
+          <w:kern w:val="0"/>
+          <w:sz w:val="19"/>
+          <w:szCs w:val="19"/>
+          <w:highlight w:val="white"/>
+          <w:lang w:val="en-GB"/>
+        </w:rPr>
+        <w:t>))</w:t>
+      </w:r>
+    </w:p>
+    <w:p>
+      <w:pPr>
+        <w:autoSpaceDE w:val="0"/>
+        <w:autoSpaceDN w:val="0"/>
+        <w:adjustRightInd w:val="0"/>
+        <w:spacing w:after="0" w:line="240" w:lineRule="auto"/>
+        <w:rPr>
+          <w:rFonts w:ascii="Cascadia Mono" w:hAnsi="Cascadia Mono" w:cs="Cascadia Mono"/>
+          <w:color w:val="000000"/>
+          <w:kern w:val="0"/>
+          <w:sz w:val="19"/>
+          <w:szCs w:val="19"/>
+          <w:highlight w:val="white"/>
+        </w:rPr>
+      </w:pPr>
+      <w:r>
+        <w:rPr>
+          <w:rFonts w:ascii="Cascadia Mono" w:hAnsi="Cascadia Mono" w:cs="Cascadia Mono"/>
+          <w:color w:val="000000"/>
+          <w:kern w:val="0"/>
+          <w:sz w:val="19"/>
+          <w:szCs w:val="19"/>
+          <w:highlight w:val="white"/>
+          <w:lang w:val="en-GB"/>
+        </w:rPr>
+        <w:tab/>
+      </w:r>
+      <w:r>
+        <w:rPr>
+          <w:rFonts w:ascii="Cascadia Mono" w:hAnsi="Cascadia Mono" w:cs="Cascadia Mono"/>
+          <w:color w:val="0000FF"/>
+          <w:kern w:val="0"/>
+          <w:sz w:val="19"/>
+          <w:szCs w:val="19"/>
+          <w:highlight w:val="white"/>
+        </w:rPr>
+        <w:t>return</w:t>
+      </w:r>
+      <w:r>
+        <w:rPr>
+          <w:rFonts w:ascii="Cascadia Mono" w:hAnsi="Cascadia Mono" w:cs="Cascadia Mono"/>
+          <w:color w:val="000000"/>
+          <w:kern w:val="0"/>
+          <w:sz w:val="19"/>
+          <w:szCs w:val="19"/>
+          <w:highlight w:val="white"/>
+        </w:rPr>
+        <w:t xml:space="preserve"> 0; </w:t>
+      </w:r>
+      <w:r>
+        <w:rPr>
+          <w:rFonts w:ascii="Cascadia Mono" w:hAnsi="Cascadia Mono" w:cs="Cascadia Mono"/>
+          <w:color w:val="008000"/>
+          <w:kern w:val="0"/>
+          <w:sz w:val="19"/>
+          <w:szCs w:val="19"/>
+          <w:highlight w:val="white"/>
+        </w:rPr>
+        <w:t>//Non è stato trovato il nome</w:t>
+      </w:r>
+      <w:r>
+        <w:rPr>
+          <w:rFonts w:ascii="Cascadia Mono" w:hAnsi="Cascadia Mono" w:cs="Cascadia Mono"/>
+          <w:color w:val="008000"/>
+          <w:kern w:val="0"/>
+          <w:sz w:val="19"/>
+          <w:szCs w:val="19"/>
+          <w:highlight w:val="white"/>
+        </w:rPr>
+        <w:t xml:space="preserve"> (chiave della mappa)</w:t>
       </w:r>
     </w:p>
     <w:p>
@@ -1319,6 +3954,123 @@
 <file path=word/numbering.xml><?xml version="1.0" encoding="utf-8"?>
 <w:numbering xmlns:wpc="http://schemas.microsoft.com/office/word/2010/wordprocessingCanvas" xmlns:cx="http://schemas.microsoft.com/office/drawing/2014/chartex" xmlns:cx1="http://schemas.microsoft.com/office/drawing/2015/9/8/chartex" xmlns:cx2="http://schemas.microsoft.com/office/drawing/2015/10/21/chartex" xmlns:cx3="http://schemas.microsoft.com/office/drawing/2016/5/9/chartex" xmlns:cx4="http://schemas.microsoft.com/office/drawing/2016/5/10/chartex" xmlns:cx5="http://schemas.microsoft.com/office/drawing/2016/5/11/chartex" xmlns:cx6="http://schemas.microsoft.com/office/drawing/2016/5/12/chartex" xmlns:cx7="http://schemas.microsoft.com/office/drawing/2016/5/13/chartex" xmlns:cx8="http://schemas.microsoft.com/office/drawing/2016/5/14/chartex" xmlns:mc="http://schemas.openxmlformats.org/markup-compatibility/2006" xmlns:aink="http://schemas.microsoft.com/office/drawing/2016/ink" xmlns:am3d="http://schemas.microsoft.com/office/drawing/2017/model3d" xmlns:o="urn:schemas-microsoft-com:office:office" xmlns:oel="http://schemas.microsoft.com/office/2019/extlst" xmlns:r="http://schemas.openxmlformats.org/officeDocument/2006/relationships" xmlns:m="http://schemas.openxmlformats.org/officeDocument/2006/math" xmlns:v="urn:schemas-microsoft-com:vml" xmlns:wp14="http://schemas.microsoft.com/office/word/2010/wordprocessingDrawing" xmlns:wp="http://schemas.openxmlformats.org/drawingml/2006/wordprocessingDrawing" xmlns:w10="urn:schemas-microsoft-com:office:word" xmlns:w="http://schemas.openxmlformats.org/wordprocessingml/2006/main" xmlns:w14="http://schemas.microsoft.com/office/word/2010/wordml" xmlns:w15="http://schemas.microsoft.com/office/word/2012/wordml" xmlns:w16cex="http://schemas.microsoft.com/office/word/2018/wordml/cex" xmlns:w16cid="http://schemas.microsoft.com/office/word/2016/wordml/cid" xmlns:w16="http://schemas.microsoft.com/office/word/2018/wordml" xmlns:w16du="http://schemas.microsoft.com/office/word/2023/wordml/word16du" xmlns:w16sdtdh="http://schemas.microsoft.com/office/word/2020/wordml/sdtdatahash" xmlns:w16sdtfl="http://schemas.microsoft.com/office/word/2024/wordml/sdtformatlock" xmlns:w16se="http://schemas.microsoft.com/office/word/2015/wordml/symex" xmlns:wpg="http://schemas.microsoft.com/office/word/2010/wordprocessingGroup" xmlns:wpi="http://schemas.microsoft.com/office/word/2010/wordprocessingInk" xmlns:wne="http://schemas.microsoft.com/office/word/2006/wordml" xmlns:wps="http://schemas.microsoft.com/office/word/2010/wordprocessingShape" mc:Ignorable="w14 w15 w16se w16cid w16 w16cex w16sdtdh w16sdtfl w16du wp14">
   <w:abstractNum w:abstractNumId="0" w15:restartNumberingAfterBreak="0">
+    <w:nsid w:val="0A66143D"/>
+    <w:multiLevelType w:val="multilevel"/>
+    <w:tmpl w:val="48A8B8EA"/>
+    <w:lvl w:ilvl="0">
+      <w:start w:val="1"/>
+      <w:numFmt w:val="decimal"/>
+      <w:lvlText w:val="%1."/>
+      <w:lvlJc w:val="left"/>
+      <w:pPr>
+        <w:tabs>
+          <w:tab w:val="num" w:pos="720"/>
+        </w:tabs>
+        <w:ind w:left="720" w:hanging="360"/>
+      </w:pPr>
+    </w:lvl>
+    <w:lvl w:ilvl="1">
+      <w:start w:val="1"/>
+      <w:numFmt w:val="bullet"/>
+      <w:lvlText w:val="o"/>
+      <w:lvlJc w:val="left"/>
+      <w:pPr>
+        <w:tabs>
+          <w:tab w:val="num" w:pos="1440"/>
+        </w:tabs>
+        <w:ind w:left="1440" w:hanging="360"/>
+      </w:pPr>
+      <w:rPr>
+        <w:rFonts w:ascii="Courier New" w:hAnsi="Courier New" w:hint="default"/>
+        <w:sz w:val="20"/>
+      </w:rPr>
+    </w:lvl>
+    <w:lvl w:ilvl="2" w:tentative="1">
+      <w:start w:val="1"/>
+      <w:numFmt w:val="decimal"/>
+      <w:lvlText w:val="%3."/>
+      <w:lvlJc w:val="left"/>
+      <w:pPr>
+        <w:tabs>
+          <w:tab w:val="num" w:pos="2160"/>
+        </w:tabs>
+        <w:ind w:left="2160" w:hanging="360"/>
+      </w:pPr>
+    </w:lvl>
+    <w:lvl w:ilvl="3" w:tentative="1">
+      <w:start w:val="1"/>
+      <w:numFmt w:val="decimal"/>
+      <w:lvlText w:val="%4."/>
+      <w:lvlJc w:val="left"/>
+      <w:pPr>
+        <w:tabs>
+          <w:tab w:val="num" w:pos="2880"/>
+        </w:tabs>
+        <w:ind w:left="2880" w:hanging="360"/>
+      </w:pPr>
+    </w:lvl>
+    <w:lvl w:ilvl="4" w:tentative="1">
+      <w:start w:val="1"/>
+      <w:numFmt w:val="decimal"/>
+      <w:lvlText w:val="%5."/>
+      <w:lvlJc w:val="left"/>
+      <w:pPr>
+        <w:tabs>
+          <w:tab w:val="num" w:pos="3600"/>
+        </w:tabs>
+        <w:ind w:left="3600" w:hanging="360"/>
+      </w:pPr>
+    </w:lvl>
+    <w:lvl w:ilvl="5" w:tentative="1">
+      <w:start w:val="1"/>
+      <w:numFmt w:val="decimal"/>
+      <w:lvlText w:val="%6."/>
+      <w:lvlJc w:val="left"/>
+      <w:pPr>
+        <w:tabs>
+          <w:tab w:val="num" w:pos="4320"/>
+        </w:tabs>
+        <w:ind w:left="4320" w:hanging="360"/>
+      </w:pPr>
+    </w:lvl>
+    <w:lvl w:ilvl="6" w:tentative="1">
+      <w:start w:val="1"/>
+      <w:numFmt w:val="decimal"/>
+      <w:lvlText w:val="%7."/>
+      <w:lvlJc w:val="left"/>
+      <w:pPr>
+        <w:tabs>
+          <w:tab w:val="num" w:pos="5040"/>
+        </w:tabs>
+        <w:ind w:left="5040" w:hanging="360"/>
+      </w:pPr>
+    </w:lvl>
+    <w:lvl w:ilvl="7" w:tentative="1">
+      <w:start w:val="1"/>
+      <w:numFmt w:val="decimal"/>
+      <w:lvlText w:val="%8."/>
+      <w:lvlJc w:val="left"/>
+      <w:pPr>
+        <w:tabs>
+          <w:tab w:val="num" w:pos="5760"/>
+        </w:tabs>
+        <w:ind w:left="5760" w:hanging="360"/>
+      </w:pPr>
+    </w:lvl>
+    <w:lvl w:ilvl="8" w:tentative="1">
+      <w:start w:val="1"/>
+      <w:numFmt w:val="decimal"/>
+      <w:lvlText w:val="%9."/>
+      <w:lvlJc w:val="left"/>
+      <w:pPr>
+        <w:tabs>
+          <w:tab w:val="num" w:pos="6480"/>
+        </w:tabs>
+        <w:ind w:left="6480" w:hanging="360"/>
+      </w:pPr>
+    </w:lvl>
+  </w:abstractNum>
+  <w:abstractNum w:abstractNumId="1" w15:restartNumberingAfterBreak="0">
     <w:nsid w:val="3183383E"/>
     <w:multiLevelType w:val="hybridMultilevel"/>
     <w:tmpl w:val="F26E100A"/>
@@ -1407,7 +4159,7 @@
       </w:pPr>
     </w:lvl>
   </w:abstractNum>
-  <w:abstractNum w:abstractNumId="1" w15:restartNumberingAfterBreak="0">
+  <w:abstractNum w:abstractNumId="2" w15:restartNumberingAfterBreak="0">
     <w:nsid w:val="336857D0"/>
     <w:multiLevelType w:val="hybridMultilevel"/>
     <w:tmpl w:val="9FDE9B2E"/>
@@ -1497,10 +4249,13 @@
     </w:lvl>
   </w:abstractNum>
   <w:num w:numId="1" w16cid:durableId="130100349">
-    <w:abstractNumId w:val="0"/>
+    <w:abstractNumId w:val="1"/>
   </w:num>
   <w:num w:numId="2" w16cid:durableId="1124614173">
-    <w:abstractNumId w:val="1"/>
+    <w:abstractNumId w:val="2"/>
+  </w:num>
+  <w:num w:numId="3" w16cid:durableId="804542835">
+    <w:abstractNumId w:val="0"/>
   </w:num>
 </w:numbering>
 </file>
@@ -2111,7 +4866,6 @@
   <w:style w:type="character" w:default="1" w:styleId="DefaultParagraphFont">
     <w:name w:val="Default Paragraph Font"/>
     <w:uiPriority w:val="1"/>
-    <w:semiHidden/>
     <w:unhideWhenUsed/>
   </w:style>
   <w:style w:type="table" w:default="1" w:styleId="TableNormal">
@@ -2823,23 +5577,6 @@
 </file>
 
 <file path=customXml/item1.xml><?xml version="1.0" encoding="utf-8"?>
-<p:properties xmlns:p="http://schemas.microsoft.com/office/2006/metadata/properties" xmlns:xsi="http://www.w3.org/2001/XMLSchema-instance" xmlns:pc="http://schemas.microsoft.com/office/infopath/2007/PartnerControls">
-  <documentManagement>
-    <_activity xmlns="1f5a06a5-d553-42c7-bc8b-bb972c4b9415" xsi:nil="true"/>
-  </documentManagement>
-</p:properties>
-</file>
-
-<file path=customXml/item2.xml><?xml version="1.0" encoding="utf-8"?>
-<?mso-contentType ?>
-<FormTemplates xmlns="http://schemas.microsoft.com/sharepoint/v3/contenttype/forms">
-  <Display>DocumentLibraryForm</Display>
-  <Edit>DocumentLibraryForm</Edit>
-  <New>DocumentLibraryForm</New>
-</FormTemplates>
-</file>
-
-<file path=customXml/item3.xml><?xml version="1.0" encoding="utf-8"?>
 <ct:contentTypeSchema xmlns:ct="http://schemas.microsoft.com/office/2006/metadata/contentType" xmlns:ma="http://schemas.microsoft.com/office/2006/metadata/properties/metaAttributes" ct:_="" ma:_="" ma:contentTypeName="Documento" ma:contentTypeID="0x0101007C32899E72379A4FBC5628731AA472F9" ma:contentTypeVersion="10" ma:contentTypeDescription="Creare un nuovo documento." ma:contentTypeScope="" ma:versionID="91c7eec8420ea9481b62d95862100d39">
   <xsd:schema xmlns:xsd="http://www.w3.org/2001/XMLSchema" xmlns:xs="http://www.w3.org/2001/XMLSchema" xmlns:p="http://schemas.microsoft.com/office/2006/metadata/properties" xmlns:ns3="1f5a06a5-d553-42c7-bc8b-bb972c4b9415" targetNamespace="http://schemas.microsoft.com/office/2006/metadata/properties" ma:root="true" ma:fieldsID="6f44fd92f8cf54f2cf64050e115a7a92" ns3:_="">
     <xsd:import namespace="1f5a06a5-d553-42c7-bc8b-bb972c4b9415"/>
@@ -3021,25 +5758,24 @@
 </ct:contentTypeSchema>
 </file>
 
-<file path=customXml/itemProps1.xml><?xml version="1.0" encoding="utf-8"?>
-<ds:datastoreItem xmlns:ds="http://schemas.openxmlformats.org/officeDocument/2006/customXml" ds:itemID="{BB9C3DA1-8EA7-45B3-B83F-C0191969D39F}">
-  <ds:schemaRefs>
-    <ds:schemaRef ds:uri="http://schemas.microsoft.com/office/2006/metadata/properties"/>
-    <ds:schemaRef ds:uri="http://schemas.microsoft.com/office/infopath/2007/PartnerControls"/>
-    <ds:schemaRef ds:uri="1f5a06a5-d553-42c7-bc8b-bb972c4b9415"/>
-  </ds:schemaRefs>
-</ds:datastoreItem>
+<file path=customXml/item2.xml><?xml version="1.0" encoding="utf-8"?>
+<?mso-contentType ?>
+<FormTemplates xmlns="http://schemas.microsoft.com/sharepoint/v3/contenttype/forms">
+  <Display>DocumentLibraryForm</Display>
+  <Edit>DocumentLibraryForm</Edit>
+  <New>DocumentLibraryForm</New>
+</FormTemplates>
 </file>
 
-<file path=customXml/itemProps2.xml><?xml version="1.0" encoding="utf-8"?>
-<ds:datastoreItem xmlns:ds="http://schemas.openxmlformats.org/officeDocument/2006/customXml" ds:itemID="{14A2BD65-0E6C-4175-A210-01AE56444EEC}">
-  <ds:schemaRefs>
-    <ds:schemaRef ds:uri="http://schemas.microsoft.com/sharepoint/v3/contenttype/forms"/>
-  </ds:schemaRefs>
-</ds:datastoreItem>
+<file path=customXml/item3.xml><?xml version="1.0" encoding="utf-8"?>
+<p:properties xmlns:p="http://schemas.microsoft.com/office/2006/metadata/properties" xmlns:xsi="http://www.w3.org/2001/XMLSchema-instance" xmlns:pc="http://schemas.microsoft.com/office/infopath/2007/PartnerControls">
+  <documentManagement>
+    <_activity xmlns="1f5a06a5-d553-42c7-bc8b-bb972c4b9415" xsi:nil="true"/>
+  </documentManagement>
+</p:properties>
 </file>
 
-<file path=customXml/itemProps3.xml><?xml version="1.0" encoding="utf-8"?>
+<file path=customXml/itemProps1.xml><?xml version="1.0" encoding="utf-8"?>
 <ds:datastoreItem xmlns:ds="http://schemas.openxmlformats.org/officeDocument/2006/customXml" ds:itemID="{7FB93098-D098-4B3F-92BE-C66F801AD2DF}">
   <ds:schemaRefs>
     <ds:schemaRef ds:uri="http://schemas.microsoft.com/office/2006/metadata/contentType"/>
@@ -3055,4 +5791,22 @@
     <ds:schemaRef ds:uri="http://schemas.microsoft.com/internal/obd"/>
   </ds:schemaRefs>
 </ds:datastoreItem>
+</file>
+
+<file path=customXml/itemProps2.xml><?xml version="1.0" encoding="utf-8"?>
+<ds:datastoreItem xmlns:ds="http://schemas.openxmlformats.org/officeDocument/2006/customXml" ds:itemID="{14A2BD65-0E6C-4175-A210-01AE56444EEC}">
+  <ds:schemaRefs>
+    <ds:schemaRef ds:uri="http://schemas.microsoft.com/sharepoint/v3/contenttype/forms"/>
+  </ds:schemaRefs>
+</ds:datastoreItem>
+</file>
+
+<file path=customXml/itemProps3.xml><?xml version="1.0" encoding="utf-8"?>
+<ds:datastoreItem xmlns:ds="http://schemas.openxmlformats.org/officeDocument/2006/customXml" ds:itemID="{BB9C3DA1-8EA7-45B3-B83F-C0191969D39F}">
+  <ds:schemaRefs>
+    <ds:schemaRef ds:uri="http://schemas.microsoft.com/office/2006/metadata/properties"/>
+    <ds:schemaRef ds:uri="http://schemas.microsoft.com/office/infopath/2007/PartnerControls"/>
+    <ds:schemaRef ds:uri="1f5a06a5-d553-42c7-bc8b-bb972c4b9415"/>
+  </ds:schemaRefs>
+</ds:datastoreItem>
 </file>
</xml_diff>